<commit_message>
docs(constitution): regenerate html/pdf/docx twins — §11.4.276 + §11.4.272-274 mirror-gap fix
Re-runs scripts/render/render-governance-twins.sh against the current
Constitution.md/CLAUDE.md/AGENTS.md/QWEN.md/GEMINI.md source, closing the
gap left by the §11.4.276 (review-round budget) landing and the earlier
§11.4.272-274 §11.4.157 lockstep mirror-gap fix this session — both of
which left the generated twins honestly stale per prior amendment-header
disclaimers. All five twin sets confirmed to contain §11.4.276 content
before commit.

Co-Authored-By: Claude Sonnet 5 <noreply@anthropic.com>
</commit_message>
<xml_diff>
--- a/AGENTS.docx
+++ b/AGENTS.docx
@@ -67,7 +67,7 @@
               <w:pStyle w:val="Compact"/>
             </w:pPr>
             <w:r>
-              <w:t xml:space="preserve">72</w:t>
+              <w:t xml:space="preserve">73</w:t>
             </w:r>
           </w:p>
         </w:tc>
@@ -115,7 +115,7 @@
               <w:pStyle w:val="Compact"/>
             </w:pPr>
             <w:r>
-              <w:t xml:space="preserve">2026-10-03T20:53:21Z</w:t>
+              <w:t xml:space="preserve">2026-10-05T07:49:21Z</w:t>
             </w:r>
           </w:p>
         </w:tc>
@@ -163,7 +163,7 @@
               <w:pStyle w:val="Compact"/>
             </w:pPr>
             <w:r>
-              <w:t xml:space="preserve">Amendment of 2026-10-04 (round 2, fix-forward on the independent Opus-xhigh review of 5fd59fa: NO-GO, 0 Blocking / 2 Important / 6 Minor) — §11.4.230(D) corrected in place: (D.3) §11.4.236 mandated validation is now AT MINIMUM source-GO + §11.4.235(A) pre/post-build gates PLUS every operator-declared QA-deploy-seam blocker (§11.4.236) and any touched §11.4.239 critical-invariant scenarios; (D.1)/(D.3)/(D.4) re-keyed from "trunk" to the increment's own INTEGRATION BRANCH, a QA build MAY be cut from a feat/product/flavor branch and for feat/ IS the §11.4.195(B) live-manual-QA vehicle (removes the trunk↔§11.4.195(B) circularity; product/flavor lines now covered); (D.3) builds coalesce (in-flight build covers prior increments) and a periodic interval must carry a recorded justification; (D.2) toggle-expiry extensions only via a §11.4.271 waiver; heading + preamble now name clause (D); next-clause-letter (E) note added; CM-QA-BUILD-CADENCE-DECLARED + CM-INCREMENT-DELIVERED-NOT-SPEC-WITHHELD contracts amended for coalescing (the latter not flagged by the review, aligned for the same false-positive reason); ledger rows OWED-GATE-107..110 formatting aligned. Constitution-submodule .html/.pdf/.docx twins NOT regenerated this round either (honestly stale per §11.4.106(E)); main-repo mirror twins regenerated in the paired main-repo commit. Prior round: Amendment of 2026-10-04 — §11.4.230 EXTENDED in place with clause (D) INCREMENTAL DELIVERY GRANULARITY + DECLARED QA-BUILD CADENCE (operator mandate 2026-10-04,</w:t>
+              <w:t xml:space="preserve">Amendment of 2026-10-05 — NEW §11.4.276 (review-round budget, 5-7 max, operator CRITICAL mandate) landed, with reconciling extensions to §11.4.134 and §11.4.267(E); full detail in the canonical Constitution.md header (same date). Prior round: Amendment of 2026-10-04 (round 2, fix-forward on the independent Opus-xhigh review of 5fd59fa: NO-GO, 0 Blocking / 2 Important / 6 Minor) — §11.4.230(D) corrected in place: (D.3) §11.4.236 mandated validation is now AT MINIMUM source-GO + §11.4.235(A) pre/post-build gates PLUS every operator-declared QA-deploy-seam blocker (§11.4.236) and any touched §11.4.239 critical-invariant scenarios; (D.1)/(D.3)/(D.4) re-keyed from "trunk" to the increment's own INTEGRATION BRANCH, a QA build MAY be cut from a feat/product/flavor branch and for feat/ IS the §11.4.195(B) live-manual-QA vehicle (removes the trunk↔§11.4.195(B) circularity; product/flavor lines now covered); (D.3) builds coalesce (in-flight build covers prior increments) and a periodic interval must carry a recorded justification; (D.2) toggle-expiry extensions only via a §11.4.271 waiver; heading + preamble now name clause (D); next-clause-letter (E) note added; CM-QA-BUILD-CADENCE-DECLARED + CM-INCREMENT-DELIVERED-NOT-SPEC-WITHHELD contracts amended for coalescing (the latter not flagged by the review, aligned for the same false-positive reason); ledger rows OWED-GATE-107..110 formatting aligned. Constitution-submodule .html/.pdf/.docx twins NOT regenerated this round either (honestly stale per §11.4.106(E)); main-repo mirror twins regenerated in the paired main-repo commit. Prior round: Amendment of 2026-10-04 — §11.4.230 EXTENDED in place with clause (D) INCREMENTAL DELIVERY GRANULARITY + DECLARED QA-BUILD CADENCE (operator mandate 2026-10-04,</w:t>
             </w:r>
             <w:r>
               <w:t xml:space="preserve"> </w:t>
@@ -20271,7 +20271,7 @@
           <w:b/>
           <w:bCs/>
         </w:rPr>
-        <w:t xml:space="preserve">§11.4.209 — Code-review MUST run on the Opus model at xhigh effort, ALWAYS — no Fable, no escalation tier, no fallback model (User mandate, 2026-09-26, supersedes 2026-09-15 and 2026-07-15).</w:t>
+        <w:t xml:space="preserve">§11.4.209 — Code-review MUST run on the Opus model at xhigh effort as PRIMARY substrate, with a genuine-unavailability Sonnet fallback — no Fable, no escalation tier (User mandate, 2026-09-26, supersedes 2026-09-15 and 2026-07-15; amended 2026-10-04 to add the Sonnet-fallback clause).</w:t>
       </w:r>
       <w:r>
         <w:t xml:space="preserve"> </w:t>
@@ -20289,7 +20289,45 @@
         <w:t xml:space="preserve">CRITICAL</w:t>
       </w:r>
       <w:r>
-        <w:t xml:space="preserve">): "Main model to use is Sonet, reviews and other heavy stuff have to be done by Opus instead of Fable!!! Fix this permanently on all levels!" Every mandatory independent code-review the constitution requires — the §11.4.125 code-review-agent gate before pre-build + main build, the §11.4.142 universal every-change-review (no exception), the §11.4.194 exhaustive all-scenario/all-angle review, iterated to a zero-finding GO per §11.4.134 — MUST be dispatched on the</w:t>
+        <w:t xml:space="preserve">): "Main model to use is Sonet, reviews and other heavy stuff have to be done by Opus instead of Fable!!! Fix this permanently on all levels!"</w:t>
+      </w:r>
+      <w:r>
+        <w:t xml:space="preserve"> </w:t>
+      </w:r>
+      <w:r>
+        <w:rPr>
+          <w:b/>
+          <w:bCs/>
+        </w:rPr>
+        <w:t xml:space="preserve">Verbatim operator mandate (2026-10-04,</w:t>
+      </w:r>
+      <w:r>
+        <w:rPr>
+          <w:b/>
+          <w:bCs/>
+        </w:rPr>
+        <w:t xml:space="preserve"> </w:t>
+      </w:r>
+      <w:r>
+        <w:rPr>
+          <w:rStyle w:val="VerbatimChar"/>
+          <w:b/>
+          <w:bCs/>
+        </w:rPr>
+        <w:t xml:space="preserve">CRITICAL</w:t>
+      </w:r>
+      <w:r>
+        <w:rPr>
+          <w:b/>
+          <w:bCs/>
+        </w:rPr>
+        <w:t xml:space="preserve">), amending clause (A) — adds a genuine-unavailability fallback, never changes the primary substrate:</w:t>
+      </w:r>
+      <w:r>
+        <w:t xml:space="preserve"> </w:t>
+      </w:r>
+      <w:r>
+        <w:t xml:space="preserve">"If we do not have access to Opus model for some reason but only to Sonnet, we MUST USE what we have! Reviews MUST BE done. Ideally with Opus model, however Sonet MUST BE used if Opus for any reason cannot be used! Add this / extend into main constiotution Submodule and apply the rule asap so nothing is blocked with review which is not performed yet! We MUST BE maximally efficient! Work MUST BE performed with all means we have at particular moment!" Every mandatory independent code-review the constitution requires — the §11.4.125 code-review-agent gate before pre-build + main build, the §11.4.142 universal every-change-review (no exception), the §11.4.194 exhaustive all-scenario/all-angle review, iterated to a zero-finding GO per §11.4.134 — MUST be dispatched on the</w:t>
       </w:r>
       <w:r>
         <w:t xml:space="preserve"> </w:t>
@@ -20331,23 +20369,26 @@
         <w:t xml:space="preserve">effort</w:t>
       </w:r>
       <w:r>
-        <w:t xml:space="preserve">, ALWAYS, whatever the size or complexity of the reviewed change. (A)</w:t>
-      </w:r>
-      <w:r>
-        <w:t xml:space="preserve"> </w:t>
-      </w:r>
-      <w:r>
-        <w:rPr>
-          <w:b/>
-          <w:bCs/>
-        </w:rPr>
-        <w:t xml:space="preserve">One substrate — no escalation tier, no fallback model</w:t>
-      </w:r>
-      <w:r>
-        <w:t xml:space="preserve"> </w:t>
-      </w:r>
-      <w:r>
-        <w:t xml:space="preserve">— Fable is NOT permitted in any role (default, escalation, or fallback: the 2026-09-15 Fable-escalation clause and the 2026-07-15 Fable-first mandate are WITHDRAWN, kept verbatim as lineage in</w:t>
+        <w:t xml:space="preserve"> </w:t>
+      </w:r>
+      <w:r>
+        <w:t xml:space="preserve">as PRIMARY substrate, whatever the size or complexity of the reviewed change. (A)</w:t>
+      </w:r>
+      <w:r>
+        <w:t xml:space="preserve"> </w:t>
+      </w:r>
+      <w:r>
+        <w:rPr>
+          <w:b/>
+          <w:bCs/>
+        </w:rPr>
+        <w:t xml:space="preserve">PRIMARY Opus-xhigh + genuine-unavailability Sonnet fallback (amended 2026-10-04) — no escalation tier, no Fable</w:t>
+      </w:r>
+      <w:r>
+        <w:t xml:space="preserve"> </w:t>
+      </w:r>
+      <w:r>
+        <w:t xml:space="preserve">— Fable is NOT permitted in any role, ever (the 2026-09-15 Fable-escalation clause and the 2026-07-15 Fable-first mandate remain WITHDRAWN, kept verbatim as lineage in</w:t>
       </w:r>
       <w:r>
         <w:t xml:space="preserve"> </w:t>
@@ -20359,7 +20400,23 @@
         <w:t xml:space="preserve">Constitution.md</w:t>
       </w:r>
       <w:r>
-        <w:t xml:space="preserve">); no other model, lower tier, or lower effort substitutes; when Opus-xhigh is genuinely unavailable (a captured FACT §11.4.6, never a guessed unavailability) the review is BLOCKED and deferred — the fact recorded, the owed review tracked (§11.4.197/§11.4.21) — and the change does NOT pass the review gate on a substitute model;</w:t>
+        <w:t xml:space="preserve">); no model other than Opus or the sanctioned Sonnet fallback below substitutes, and no lower effort for Opus itself is acceptable; when Opus-xhigh is genuinely unavailable (a captured FACT §11.4.6, never a guessed unavailability) the review MUST be dispatched on</w:t>
+      </w:r>
+      <w:r>
+        <w:t xml:space="preserve"> </w:t>
+      </w:r>
+      <w:r>
+        <w:rPr>
+          <w:b/>
+          <w:bCs/>
+        </w:rPr>
+        <w:t xml:space="preserve">Sonnet</w:t>
+      </w:r>
+      <w:r>
+        <w:t xml:space="preserve"> </w:t>
+      </w:r>
+      <w:r>
+        <w:t xml:space="preserve">(at the highest effort the dispatch path can set) rather than blocked — the sole sanctioned fallback, per the verbatim 2026-10-04 mandate above: reviews MUST be done with whatever capable means are actually available, Opus ideally, Sonnet when Opus genuinely cannot be used; the Opus-unavailability FACT and the Sonnet substitution MUST both be recorded honestly in the review's captured evidence (§11.4.5/.69) — a Sonnet-fallback review is NEVER silently presented as if it ran on Opus; a review is NEVER left undone / blocked solely because Opus is unavailable while Sonnet is reachable (§11.4.183 maximal multi-agent utilization). ONLY when BOTH Opus and Sonnet are genuinely unavailable (each established as its own captured FACT per §11.4.6, never guessed) is the review BLOCKED and deferred — the fact recorded, the owed review tracked (§11.4.197/§11.4.21);</w:t>
       </w:r>
       <w:r>
         <w:t xml:space="preserve"> </w:t>
@@ -20374,7 +20431,7 @@
         <w:t xml:space="preserve"> </w:t>
       </w:r>
       <w:r>
-        <w:t xml:space="preserve">is REQUIRED (the §11.4.194 all-angle depth is unreachable lower). (B)</w:t>
+        <w:t xml:space="preserve">is REQUIRED on whichever substrate actually runs WHERE THE DISPATCH PATH CAN SET IT (the §11.4.194 all-angle depth is unreachable lower) — where it cannot (the pre-existing §11.4.231(F.2) harness gap), clause (C)'s honesty rule governs: the gap is recorded, never silently claimed as xhigh unverified. (B)</w:t>
       </w:r>
       <w:r>
         <w:t xml:space="preserve"> </w:t>
@@ -20390,7 +20447,7 @@
         <w:t xml:space="preserve"> </w:t>
       </w:r>
       <w:r>
-        <w:t xml:space="preserve">— the Opus-xhigh model is the structurally-separated reviewer, never the author; §11.4.209 sets the review's MODEL + EFFORT, not its independence / iterate-until-GO (§11.4.134) / captured-evidence (§11.4.5/.69/.107). (C)</w:t>
+        <w:t xml:space="preserve">— the reviewing model (Opus or the sanctioned Sonnet fallback) is the structurally-separated reviewer, never the author; §11.4.209 sets the review's MODEL + EFFORT, not its independence / iterate-until-GO (§11.4.134) / captured-evidence (§11.4.5/.69/.107). (C)</w:t>
       </w:r>
       <w:r>
         <w:t xml:space="preserve"> </w:t>
@@ -20406,7 +20463,7 @@
         <w:t xml:space="preserve"> </w:t>
       </w:r>
       <w:r>
-        <w:t xml:space="preserve">— a review claimed done that ran on any non-Opus model or below</w:t>
+        <w:t xml:space="preserve">— a review claimed done that ran on Fable, Haiku, or any model other than Opus or the sanctioned Sonnet fallback, or below</w:t>
       </w:r>
       <w:r>
         <w:t xml:space="preserve"> </w:t>
@@ -20418,10 +20475,7 @@
         <w:t xml:space="preserve">xhigh</w:t>
       </w:r>
       <w:r>
-        <w:t xml:space="preserve"> </w:t>
-      </w:r>
-      <w:r>
-        <w:t xml:space="preserve">is a §11.4 bluff at the review-substrate layer; the review's captured evidence records which model + effort actually performed it (where the dispatch path cannot set or report effort, §11.4.231(F.2), that gap is recorded instead of a claimed</w:t>
+        <w:t xml:space="preserve">, or on Sonnet with no recorded Opus-unavailability fact, is a §11.4 bluff at the review-substrate layer; the review's captured evidence records which model + effort actually performed it (where the dispatch path cannot set or report effort, §11.4.231(F.2), that gap is recorded instead of a claimed</w:t>
       </w:r>
       <w:r>
         <w:t xml:space="preserve"> </w:t>
@@ -20449,7 +20503,22 @@
         <w:t xml:space="preserve"> </w:t>
       </w:r>
       <w:r>
-        <w:t xml:space="preserve">— any plaintext credential value that has appeared in documentation, a spec, or commit history is compromised from the moment of commit; an illustration never embeds a real-looking username/password pair without stating it is compromised-by-disclosure. STRENGTHENS §11.4.125/.142/.194/.134 — does NOT replace them; it pins the review's execution substrate. Classification: universal (§11.4.17). Composes §11.4.125/.134/.142/.194/.6/.10/.20/.21/.70/.196/.197/.231. Propagation gate</w:t>
+        <w:t xml:space="preserve">— any plaintext credential value that has appeared in documentation, a spec, or commit history is compromised from the moment of commit; an illustration never embeds a real-looking username/password pair without stating it is compromised-by-disclosure. STRENGTHENS §11.4.125/.142/.194/.134 — does NOT replace them; it pins the review's execution substrate, now a PRIMARY-plus-sanctioned-fallback pin rather than a single-model pin. Classification: universal (§11.4.17). Composes §11.4.125/.134/.142/.194/.6/.10/.20/.21/.70/.183/.196/.197/.231(A — the</w:t>
+      </w:r>
+      <w:r>
+        <w:t xml:space="preserve"> </w:t>
+      </w:r>
+      <w:r>
+        <w:rPr>
+          <w:rStyle w:val="VerbatimChar"/>
+        </w:rPr>
+        <w:t xml:space="preserve">sonnet</w:t>
+      </w:r>
+      <w:r>
+        <w:t xml:space="preserve"> </w:t>
+      </w:r>
+      <w:r>
+        <w:t xml:space="preserve">rung this fallback draws on). Propagation gate</w:t>
       </w:r>
       <w:r>
         <w:t xml:space="preserve"> </w:t>
@@ -20491,7 +20560,7 @@
         <w:t xml:space="preserve"> </w:t>
       </w:r>
       <w:r>
-        <w:t xml:space="preserve">+ paired §1.1 mutation.</w:t>
+        <w:t xml:space="preserve">(amended 2026-10-04: now accepts model=Opus+xhigh OR model=Sonnet carrying a captured Opus-unavailability fact; FAILs on Fable/Haiku/any other model, or on Sonnet with no recorded fact; gate-code = separate work item, NOT claimed shipped §11.4.6) + paired §1.1 mutation.</w:t>
       </w:r>
       <w:r>
         <w:t xml:space="preserve"> </w:t>
@@ -20524,7 +20593,7 @@
         <w:t xml:space="preserve"> </w:t>
       </w:r>
       <w:r>
-        <w:t xml:space="preserve">§11.4.209. Non-compliance is a release blocker. No escape hatch — no</w:t>
+        <w:t xml:space="preserve">§11.4.209. Non-compliance is a release blocker. No escape hatch beyond the sanctioned (A) Sonnet fallback (itself requiring a captured Opus-unavailability FACT, never a guess) — no</w:t>
       </w:r>
       <w:r>
         <w:t xml:space="preserve"> </w:t>
@@ -20581,7 +20650,7 @@
         <w:rPr>
           <w:rStyle w:val="VerbatimChar"/>
         </w:rPr>
-        <w:t xml:space="preserve">--escalate-to-other-model</w:t>
+        <w:t xml:space="preserve">--escalate-to-fable-or-haiku</w:t>
       </w:r>
       <w:r>
         <w:t xml:space="preserve">,</w:t>
@@ -20593,7 +20662,19 @@
         <w:rPr>
           <w:rStyle w:val="VerbatimChar"/>
         </w:rPr>
-        <w:t xml:space="preserve">--substitute-model-on-unavailability</w:t>
+        <w:t xml:space="preserve">--sonnet-fallback-without-recorded-fact</w:t>
+      </w:r>
+      <w:r>
+        <w:t xml:space="preserve">,</w:t>
+      </w:r>
+      <w:r>
+        <w:t xml:space="preserve"> </w:t>
+      </w:r>
+      <w:r>
+        <w:rPr>
+          <w:rStyle w:val="VerbatimChar"/>
+        </w:rPr>
+        <w:t xml:space="preserve">--leave-review-blocked-while-sonnet-reachable</w:t>
       </w:r>
       <w:r>
         <w:t xml:space="preserve"> </w:t>
@@ -20782,7 +20863,7 @@
           <w:b/>
           <w:bCs/>
         </w:rPr>
-        <w:t xml:space="preserve">§11.4.211 — Merge-conflict resolution during main→feature/product/flavor merges MUST run on the Opus model at xhigh effort, ALWAYS — no Fable, no fallback model (User mandate, 2026-07-16; amended 2026-09-26).</w:t>
+        <w:t xml:space="preserve">§11.4.211 — Merge-conflict resolution during main→feature/product/flavor merges MUST run on the Opus model at xhigh effort as PRIMARY substrate, with a genuine-unavailability Sonnet fallback — no Fable (User mandate, 2026-07-16; amended 2026-09-26; amended again 2026-10-04 to add the Sonnet-fallback clause).</w:t>
       </w:r>
       <w:r>
         <w:t xml:space="preserve"> </w:t>
@@ -20800,7 +20881,45 @@
         <w:t xml:space="preserve">CRITICAL</w:t>
       </w:r>
       <w:r>
-        <w:t xml:space="preserve">), superseding the model choice of the 2026-07-16 mandate: "Main model to use is Sonet, reviews and other heavy stuff have to be done by Opus instead of Fable!!! Fix this permanently on all levels!" The 2026-07-16 mandate ("During the merge of main branch to all feature/product/flavor branches of tracks 2 - 4, if conflicts happen they MUST BE resolved using Fable model with xhigh effort! If Fable is not available, then with Opus with xhigh!") is WITHDRAWN as to its model choice and kept as lineage; its scope and its</w:t>
+        <w:t xml:space="preserve">), superseding the model choice of the 2026-07-16 mandate: "Main model to use is Sonet, reviews and other heavy stuff have to be done by Opus instead of Fable!!! Fix this permanently on all levels!"</w:t>
+      </w:r>
+      <w:r>
+        <w:t xml:space="preserve"> </w:t>
+      </w:r>
+      <w:r>
+        <w:rPr>
+          <w:b/>
+          <w:bCs/>
+        </w:rPr>
+        <w:t xml:space="preserve">Verbatim operator mandate (2026-10-04,</w:t>
+      </w:r>
+      <w:r>
+        <w:rPr>
+          <w:b/>
+          <w:bCs/>
+        </w:rPr>
+        <w:t xml:space="preserve"> </w:t>
+      </w:r>
+      <w:r>
+        <w:rPr>
+          <w:rStyle w:val="VerbatimChar"/>
+          <w:b/>
+          <w:bCs/>
+        </w:rPr>
+        <w:t xml:space="preserve">CRITICAL</w:t>
+      </w:r>
+      <w:r>
+        <w:rPr>
+          <w:b/>
+          <w:bCs/>
+        </w:rPr>
+        <w:t xml:space="preserve">), amending clause (A) — adds a genuine-unavailability fallback, never changes the primary substrate:</w:t>
+      </w:r>
+      <w:r>
+        <w:t xml:space="preserve"> </w:t>
+      </w:r>
+      <w:r>
+        <w:t xml:space="preserve">"If we do not have access to Opus model for some reason but only to Sonnet, we MUST USE what we have! Reviews MUST BE done. Ideally with Opus model, however Sonet MUST BE used if Opus for any reason cannot be used! Add this / extend into main constiotution Submodule and apply the rule asap so nothing is blocked with review which is not performed yet! We MUST BE maximally efficient! Work MUST BE performed with all means we have at particular moment!" The 2026-07-16 mandate ("During the merge of main branch to all feature/product/flavor branches of tracks 2 - 4, if conflicts happen they MUST BE resolved using Fable model with xhigh effort! If Fable is not available, then with Opus with xhigh!") remains WITHDRAWN as to its model choice and kept as lineage; its scope and its</w:t>
       </w:r>
       <w:r>
         <w:t xml:space="preserve"> </w:t>
@@ -20875,23 +20994,42 @@
         <w:t xml:space="preserve">effort</w:t>
       </w:r>
       <w:r>
-        <w:t xml:space="preserve">, ALWAYS; the merge-resolution analogue of §11.4.209 (which pins the same model + effort for code-REVIEW), pinning it for the DECISION-MAKING of conflict resolution (which side to keep, how to UNION both sides without loss, marker removal, semantic reconciliation of divergent edits).</w:t>
-      </w:r>
-      <w:r>
-        <w:t xml:space="preserve"> </w:t>
-      </w:r>
-      <w:r>
-        <w:rPr>
-          <w:b/>
-          <w:bCs/>
-        </w:rPr>
-        <w:t xml:space="preserve">(A) One substrate — no fallback model:</w:t>
-      </w:r>
-      <w:r>
-        <w:t xml:space="preserve"> </w:t>
-      </w:r>
-      <w:r>
-        <w:t xml:space="preserve">Fable is NOT permitted in any role and no lower-effort or other model is an acceptable substrate; when Opus-xhigh is genuinely unavailable (not configured / rate-limited / unreachable, established as FACT §11.4.6 — never a guessed unavailability) the conflict resolution is BLOCKED and deferred — the fact recorded, the merge NOT completed on a substitute model, the branch left quiescent with no conflict marker committed;</w:t>
+        <w:t xml:space="preserve"> </w:t>
+      </w:r>
+      <w:r>
+        <w:t xml:space="preserve">as PRIMARY substrate; the merge-resolution analogue of §11.4.209, pinning it for the DECISION-MAKING of conflict resolution (which side to keep, how to UNION both sides without loss, marker removal, semantic reconciliation of divergent edits).</w:t>
+      </w:r>
+      <w:r>
+        <w:t xml:space="preserve"> </w:t>
+      </w:r>
+      <w:r>
+        <w:rPr>
+          <w:b/>
+          <w:bCs/>
+        </w:rPr>
+        <w:t xml:space="preserve">(A) PRIMARY Opus-xhigh + genuine-unavailability Sonnet fallback (amended 2026-10-04) — no Fable:</w:t>
+      </w:r>
+      <w:r>
+        <w:t xml:space="preserve"> </w:t>
+      </w:r>
+      <w:r>
+        <w:t xml:space="preserve">Fable is NOT permitted in any role, ever, and no lower effort for Opus itself is acceptable; when Opus-xhigh is genuinely unavailable (not configured / rate-limited / unreachable, established as FACT §11.4.6 — never a guessed unavailability) the conflict resolution MUST be carried out on</w:t>
+      </w:r>
+      <w:r>
+        <w:t xml:space="preserve"> </w:t>
+      </w:r>
+      <w:r>
+        <w:rPr>
+          <w:b/>
+          <w:bCs/>
+        </w:rPr>
+        <w:t xml:space="preserve">Sonnet</w:t>
+      </w:r>
+      <w:r>
+        <w:t xml:space="preserve"> </w:t>
+      </w:r>
+      <w:r>
+        <w:t xml:space="preserve">(at the highest effort the dispatch path can set) rather than blocked — the sole sanctioned fallback, per the verbatim 2026-10-04 mandate above; the Opus-unavailability FACT and the Sonnet substitution MUST both be recorded honestly in the merge's captured evidence (§11.4.5/.69) — a Sonnet-resolved merge is NEVER silently presented as if Opus resolved it. ONLY when BOTH Opus and Sonnet are genuinely unavailable (each established as its own captured FACT per §11.4.6, never guessed) is the resolution BLOCKED and deferred — the fact recorded, the merge NOT completed, the branch left quiescent with no conflict marker committed;</w:t>
       </w:r>
       <w:r>
         <w:t xml:space="preserve"> </w:t>
@@ -20906,7 +21044,7 @@
         <w:t xml:space="preserve"> </w:t>
       </w:r>
       <w:r>
-        <w:t xml:space="preserve">REQUIRED (a careless resolution silently drops a commit or commits a marker).</w:t>
+        <w:t xml:space="preserve">REQUIRED on whichever substrate actually runs WHERE THE DISPATCH PATH CAN SET IT (a careless resolution silently drops a commit or commits a marker) — where it cannot (the pre-existing §11.4.231(F.2) harness gap), clause (D)'s honesty rule governs: the gap is recorded, never silently claimed as xhigh unverified.</w:t>
       </w:r>
       <w:r>
         <w:t xml:space="preserve"> </w:t>
@@ -20981,7 +21119,7 @@
         <w:t xml:space="preserve"> </w:t>
       </w:r>
       <w:r>
-        <w:t xml:space="preserve">a merge whose conflicts were resolved on any non-Opus model or below</w:t>
+        <w:t xml:space="preserve">a merge whose conflicts were resolved on Fable or any model other than Opus or the sanctioned Sonnet fallback, or below</w:t>
       </w:r>
       <w:r>
         <w:t xml:space="preserve"> </w:t>
@@ -20993,10 +21131,37 @@
         <w:t xml:space="preserve">xhigh</w:t>
       </w:r>
       <w:r>
-        <w:t xml:space="preserve"> </w:t>
-      </w:r>
-      <w:r>
-        <w:t xml:space="preserve">is a §11.4 bluff at the merge-resolution-substrate layer — the merge's captured evidence records which model + effort resolved the conflicts (and, when blocked, the FACT of Opus's unavailability). STRICT EXTENSION of §11.4.209 to merge-CONFLICT resolution; STRENGTHENS §11.4.188/§11.4.195/§11.4.41 by pinning the substrate of their conflict-resolution step. Classification: universal (§11.4.17). Composes §11.4.209/.188/.195/.41/.113/§9/§9.2/.6/.167(D)(I)/.84/.37/.71/.196. Propagation gate</w:t>
+        <w:t xml:space="preserve">, or on Sonnet with no recorded Opus-unavailability fact, is a §11.4 bluff at the merge-resolution-substrate layer — the merge's captured evidence records which model + effort resolved the conflicts (and, when blocked, the FACT that both Opus and Sonnet were unavailable). Where the dispatch path cannot set or report the effort (the §11.4.231(F.2) harness gap), the evidence records that gap honestly and the merge is never claimed to have run at</w:t>
+      </w:r>
+      <w:r>
+        <w:t xml:space="preserve"> </w:t>
+      </w:r>
+      <w:r>
+        <w:rPr>
+          <w:rStyle w:val="VerbatimChar"/>
+        </w:rPr>
+        <w:t xml:space="preserve">xhigh</w:t>
+      </w:r>
+      <w:r>
+        <w:t xml:space="preserve"> </w:t>
+      </w:r>
+      <w:r>
+        <w:t xml:space="preserve">on an unverified basis. STRICT EXTENSION of §11.4.209 to merge-CONFLICT resolution; STRENGTHENS §11.4.188/§11.4.195/§11.4.41 by pinning the substrate of their conflict-resolution step. Classification: universal (§11.4.17). Composes §11.4.209/.183/.188/.195/.41/.113/§9/§9.2/.6/.167(D)(I)/.84/.37/.71/.196/.231(A — the</w:t>
+      </w:r>
+      <w:r>
+        <w:t xml:space="preserve"> </w:t>
+      </w:r>
+      <w:r>
+        <w:rPr>
+          <w:rStyle w:val="VerbatimChar"/>
+        </w:rPr>
+        <w:t xml:space="preserve">sonnet</w:t>
+      </w:r>
+      <w:r>
+        <w:t xml:space="preserve"> </w:t>
+      </w:r>
+      <w:r>
+        <w:t xml:space="preserve">rung this fallback draws on). Propagation gate</w:t>
       </w:r>
       <w:r>
         <w:t xml:space="preserve"> </w:t>
@@ -21038,7 +21203,7 @@
         <w:t xml:space="preserve"> </w:t>
       </w:r>
       <w:r>
-        <w:t xml:space="preserve">+ paired §1.1 mutation.</w:t>
+        <w:t xml:space="preserve">(amended 2026-10-04: now accepts model=Opus+xhigh OR model=Sonnet carrying a captured Opus-unavailability fact; FAILs on Fable/any other model, or on Sonnet with no recorded fact; gate-code = separate work item, NOT claimed shipped §11.4.6) + paired §1.1 mutation.</w:t>
       </w:r>
       <w:r>
         <w:t xml:space="preserve"> </w:t>
@@ -21071,7 +21236,7 @@
         <w:t xml:space="preserve"> </w:t>
       </w:r>
       <w:r>
-        <w:t xml:space="preserve">§11.4.211. Non-compliance is a release blocker. No escape hatch — no</w:t>
+        <w:t xml:space="preserve">§11.4.211. Non-compliance is a release blocker. No escape hatch beyond the sanctioned (A) Sonnet fallback (itself requiring a captured Opus-unavailability FACT, never a guess) — no</w:t>
       </w:r>
       <w:r>
         <w:t xml:space="preserve"> </w:t>
@@ -21128,7 +21293,31 @@
         <w:rPr>
           <w:rStyle w:val="VerbatimChar"/>
         </w:rPr>
-        <w:t xml:space="preserve">--substitute-model-on-unavailability</w:t>
+        <w:t xml:space="preserve">--escalate-to-fable</w:t>
+      </w:r>
+      <w:r>
+        <w:t xml:space="preserve">,</w:t>
+      </w:r>
+      <w:r>
+        <w:t xml:space="preserve"> </w:t>
+      </w:r>
+      <w:r>
+        <w:rPr>
+          <w:rStyle w:val="VerbatimChar"/>
+        </w:rPr>
+        <w:t xml:space="preserve">--sonnet-fallback-without-recorded-fact</w:t>
+      </w:r>
+      <w:r>
+        <w:t xml:space="preserve">,</w:t>
+      </w:r>
+      <w:r>
+        <w:t xml:space="preserve"> </w:t>
+      </w:r>
+      <w:r>
+        <w:rPr>
+          <w:rStyle w:val="VerbatimChar"/>
+        </w:rPr>
+        <w:t xml:space="preserve">--leave-merge-blocked-while-sonnet-reachable</w:t>
       </w:r>
       <w:r>
         <w:t xml:space="preserve"> </w:t>
@@ -28582,7 +28771,10 @@
         <w:t xml:space="preserve">effort</w:t>
       </w:r>
       <w:r>
-        <w:t xml:space="preserve">, ALWAYS — no Fable, no fallback model; genuine Opus-unavailability BLOCKS the review, NEVER a lower tier, another model, or a lower effort) and §11.4.211 (every main→feature/product/flavor merge-CONFLICT resolution runs on the SAME Opus-xhigh substrate, blocked — never substituted — on unavailability). Those two anchors are STRICTER, SCOPE-SPECIFIC pins that this anchor's general ladder does not reach — review and merge-conflict-resolution are NOT eligible for sonnet/opus-by-complexity dispatch; they run on their pinned substrate ALWAYS, regardless of how "simple" the reviewed change or the conflict appears. A review or merge-conflict resolution dispatched on anything other than the §11.4.209/§11.4.211 Opus-xhigh pin is a violation of THOSE anchors, not a valid application of §11.4.231's general ladder.</w:t>
+        <w:t xml:space="preserve"> </w:t>
+      </w:r>
+      <w:r>
+        <w:t xml:space="preserve">as PRIMARY substrate, with a genuine-unavailability SONNET fallback, amended 2026-10-04 — no Fable, no Haiku, no other fallback model; BLOCKED only when BOTH Opus and Sonnet are genuinely unavailable, NEVER a lower tier or any other model) and §11.4.211 (every main→feature/product/flavor merge-CONFLICT resolution runs on the SAME Opus-xhigh-primary-plus-Sonnet-fallback substrate, blocked only when both Opus and Sonnet are genuinely unavailable). Those two anchors are STRICTER, SCOPE-SPECIFIC pins that this anchor's general ladder does not reach — review and merge-conflict-resolution are NOT eligible for sonnet/opus-by-complexity dispatch; they run on their pinned substrate ALWAYS, regardless of how "simple" the reviewed change or the conflict appears. A review or merge-conflict resolution dispatched on anything other than the §11.4.209/§11.4.211 Opus-xhigh-primary-plus-sanctioned-Sonnet-fallback substrate (amended 2026-10-04) is a violation of THOSE anchors, not a valid application of §11.4.231's general ladder.</w:t>
       </w:r>
     </w:p>
     <w:p>
@@ -28866,7 +29058,7 @@
         <w:t xml:space="preserve"> </w:t>
       </w:r>
       <w:r>
-        <w:t xml:space="preserve">effort on Opus (no fallback model), and this general effort ladder NEVER tiers those two scopes below</w:t>
+        <w:t xml:space="preserve">effort on Opus as PRIMARY substrate (or, on a captured genuine Opus-unavailability FACT, on the §11.4.209/§11.4.211 sanctioned Sonnet fallback, amended 2026-10-04 — Fable and Haiku remain forbidden in every role), and this general effort ladder NEVER tiers those two scopes below</w:t>
       </w:r>
       <w:r>
         <w:t xml:space="preserve"> </w:t>
@@ -28881,7 +29073,7 @@
         <w:t xml:space="preserve"> </w:t>
       </w:r>
       <w:r>
-        <w:t xml:space="preserve">regardless of how "simple" the reviewed change or the conflict appears — a review / merge-conflict resolution run below</w:t>
+        <w:t xml:space="preserve">where the dispatch path can set it, regardless of how "simple" the reviewed change or the conflict appears — a review / merge-conflict resolution run below</w:t>
       </w:r>
       <w:r>
         <w:t xml:space="preserve"> </w:t>
@@ -28896,7 +29088,7 @@
         <w:t xml:space="preserve"> </w:t>
       </w:r>
       <w:r>
-        <w:t xml:space="preserve">is a §11.4.209 / §11.4.211 violation, not a valid application of this ladder. (F.4) HONEST BOUNDARY (§11.4.6) — "lightest capable effort" is a CONJUNCTION, not a discount: an effort setting that yields a shallow / guessed / under-verified result is UNDER-POWERED, a FALSE ECONOMY, and a §11.4 violation of PASS-bluff severity, exactly as an under-powered MODEL tier is per clause (D); capability determinations are evidence-based, never guessed (§11.4.6).</w:t>
+        <w:t xml:space="preserve">on a path that COULD set it, or run on a model other than Opus or the sanctioned Sonnet fallback, is a §11.4.209 / §11.4.211 violation, not a valid application of this ladder. (F.4) HONEST BOUNDARY (§11.4.6) — "lightest capable effort" is a CONJUNCTION, not a discount: an effort setting that yields a shallow / guessed / under-verified result is UNDER-POWERED, a FALSE ECONOMY, and a §11.4 violation of PASS-bluff severity, exactly as an under-powered MODEL tier is per clause (D); capability determinations are evidence-based, never guessed (§11.4.6).</w:t>
       </w:r>
     </w:p>
     <w:p>
@@ -33843,7 +34035,10 @@
         <w:t xml:space="preserve">xhigh</w:t>
       </w:r>
       <w:r>
-        <w:t xml:space="preserve">, no fallback model) both remain in force unmodified for their own domains.</w:t>
+        <w:t xml:space="preserve"> </w:t>
+      </w:r>
+      <w:r>
+        <w:t xml:space="preserve">as PRIMARY substrate, with a genuine-unavailability Sonnet fallback, amended 2026-10-04; Fable and Haiku remain forbidden in every role) both remain in force unmodified for their own domains.</w:t>
       </w:r>
       <w:r>
         <w:t xml:space="preserve"> </w:t>
@@ -43816,46 +44011,52 @@
           <w:b/>
           <w:bCs/>
         </w:rPr>
-        <w:t xml:space="preserve">§11.4.275 — Semantic (Lumen) index + indexing-efficiency gate + universal agent/subagent accessibility (research-derived, 2026-09-24).</w:t>
-      </w:r>
-      <w:r>
-        <w:t xml:space="preserve"> </w:t>
-      </w:r>
-      <w:r>
-        <w:t xml:space="preserve">Compact summary: every code index the project maintains — the structural CodeGraph index (§11.4.78) AND the semantic Lumen index, and any future code index — MUST (A) be reachable by EVERY agent AND every dispatched subagent through a server definition they can actually resolve (committed project config or installed plugin); a config that ENABLES a server nothing DECLARES is a violation; proof = a real tool call from a dispatched subagent returning an index-only fact (§11.4.78(4) unforgeable challenge), un-drivable agents = documented §11.4.3 SKIP; (B) for the semantic index: embedding model provisioned rootless (§11.4.161) and proven by a real embed call returning the declared dimensions, scope GENERATED from the same class source as the structural scope (</w:t>
-      </w:r>
-      <w:r>
-        <w:rPr>
-          <w:rStyle w:val="VerbatimChar"/>
-        </w:rPr>
-        <w:t xml:space="preserve">&lt;constitution&gt;/scripts/lumen/gen_lumenignore.py</w:t>
-      </w:r>
-      <w:r>
-        <w:t xml:space="preserve">), health = files AND chunks non-zero + known-symbol hit + negative control + freshness within consumer TTL; (C) be called ready ONLY when pending work == 0, state complete, file count within consumer tolerance of the accepted count, schema indexes present — every count/empty result control-needled (§11.4.273); (D) earn its place by a DETERMINISTIC benchmark (fixed queries + golden answers, index route vs grep+read, N≥3 identical canonical hashes per §11.4.50, bytes/est-tokens/p50/p95/correctness per query), reduction computed ONLY over queries both routes answered correctly, wrong answers listed BY ID and never averaged away, thresholds = consumer DATA (§11.4.35); (E) route structural→CodeGraph, conceptual→Lumen before grep+read (§11.4.141) except measured-wrong query classes (fall back + tracked); (F) root-cause + patch performance defects in the version-keyed runner with RED→GREEN + paired mutation + byte-copy equivalence proof; (G) writes via the single writer entry (§11.4.80(5)), live reads read-only. Forensic FACTS (genericised): a configured semantic server reported 0 files / no model / never indexed; the structural index cut tokens 69.2% over 8 both-correct fixture queries yet answered 5 of 15 fixture queries WRONG (grep+read 2 of 15); one uncached full-table file-list query was 93.4% of resolve time; an FK-cascade stalled the bulk window; a launcher classifying</w:t>
-      </w:r>
-      <w:r>
-        <w:t xml:space="preserve"> </w:t>
-      </w:r>
-      <w:r>
-        <w:rPr>
-          <w:rStyle w:val="VerbatimChar"/>
-        </w:rPr>
-        <w:t xml:space="preserve">sync</w:t>
-      </w:r>
-      <w:r>
-        <w:t xml:space="preserve"> </w:t>
-      </w:r>
-      <w:r>
-        <w:t xml:space="preserve">by stored rows instead of pending backlog ran a tens-of-millions-reference bulk job stock + foreground + unsupervised; the vendor reaps locks by age not liveness and a writable open recreates dropped indexes without the lock; an errored instrument's empty result was nearly read as absence. Latent binding (§11.4.96 pattern): a project with no semantic index is bound only for the indexes it maintains; the semantic clauses bind the moment it adds one. Honest boundary (§11.4.6): proves reachable/complete/scoped/measured, not every answer correct; never licenses narrowing scope to hit a threshold (§11.4.66); the reference benchmark harness is still a prototype outside the constitution tree (landing = owed work). Classification: universal (§11.4.17). Propagation gate</w:t>
-      </w:r>
-      <w:r>
-        <w:t xml:space="preserve"> </w:t>
-      </w:r>
-      <w:r>
-        <w:rPr>
-          <w:rStyle w:val="VerbatimChar"/>
-        </w:rPr>
-        <w:t xml:space="preserve">CM-COVENANT-114-275-PROPAGATION</w:t>
+        <w:t xml:space="preserve">§11.4.272 — Dynamic, on-demand skill/extension activation: the active capability surface is the MINIMUM needed now, everything else stays DISCOVERABLE and one command away (User mandate, 2026-09-07).</w:t>
+      </w:r>
+      <w:r>
+        <w:t xml:space="preserve"> </w:t>
+      </w:r>
+      <w:r>
+        <w:t xml:space="preserve">Compact summary: verbatim operator mandate ("We MUST use activelly only Skills we need at particular moment! ... fully dynamic so token use is ALWAYS at the minimum and any of Skills and the extensions activated / deactivated as they are needed / used!"); forensic case study (measured 2026-09-07, Claude Code 2.1.263): a 955-skill host pool renders 29,153 B (~7,288 tok) of NAMES every turn, 101,279 B (~25,319 tok/turn) with description fields — a 3.5x render-mode cliff. Every project whose agent platform exposes a capability surface MUST keep the ACTIVE surface at the minimum genuinely needed, everything else activatable on demand: (A) minimal declared</w:t>
+      </w:r>
+      <w:r>
+        <w:t xml:space="preserve"> </w:t>
+      </w:r>
+      <w:r>
+        <w:rPr>
+          <w:rStyle w:val="VerbatimChar"/>
+        </w:rPr>
+        <w:t xml:space="preserve">core</w:t>
+      </w:r>
+      <w:r>
+        <w:t xml:space="preserve"> </w:t>
+      </w:r>
+      <w:r>
+        <w:t xml:space="preserve">set always active, everything else inactive-by-default; (B) discoverability NEVER traded for tokens — a deactivated capability stays findable via an always-available index, §11.4.102(B) binds unconditionally; (C) fail SAFE never silent (§11.4.201) — a failed activation exits non-zero + rolls back, never leaves a dangling/unusable claim; (D) concurrency-safe by reference counting (§11.4.119/§11.4.176) — one session's deactivation never strips a capability another session is using; (E) honest asymmetry (§11.4.6) — measured first-hand that activation hot-loads but deactivation does NOT hot-unload in the live session, so the saving is a minimal session-start baseline plus on-demand growth, never an in-session token-freeing claim; the platform's own</w:t>
+      </w:r>
+      <w:r>
+        <w:t xml:space="preserve"> </w:t>
+      </w:r>
+      <w:r>
+        <w:rPr>
+          <w:rStyle w:val="VerbatimChar"/>
+        </w:rPr>
+        <w:t xml:space="preserve">permissions.deny Skill(name)</w:t>
+      </w:r>
+      <w:r>
+        <w:t xml:space="preserve"> </w:t>
+      </w:r>
+      <w:r>
+        <w:t xml:space="preserve">blocks invocation without removing the rendered entry, saving ZERO tokens; (F) a budget gate guards BOTH the name-only and description-eager render modes; (G) works with AND without the constitution submodule vendored — an explicit resolution order ending in honest, loud degradation, never a silent no-op; (H) PRUNE-TO-CORE is the default (operator decision 2026-09-07) and is NOT a §11.4.122 silent removal — structurally reversible+visible by construction (LISTED in the core catalogue, ACTIVATABLE by one command, NOT DELETED — moved/linked not destroyed), with an explicit opt-out at session+project scope, refusing loudly rather than risking content on any unsafe demotion. Honest boundary (§11.4.6): reduces per-turn capability-LIST cost only, never a skill's invoked body cost, never a substitute for §11.4.102(B) discovery, never a licence to hide a needed capability. Classification: universal (§11.4.17). Composes §9.2/§11.4.6/§11.4.28/§11.4.35/§11.4.74/§11.4.80/§11.4.102(B)/§11.4.119/§11.4.122/§11.4.141/§11.4.164/§11.4.174/§11.4.176/§11.4.177/§11.4.180/§11.4.201/§1.1. Propagation gate</w:t>
+      </w:r>
+      <w:r>
+        <w:t xml:space="preserve"> </w:t>
+      </w:r>
+      <w:r>
+        <w:rPr>
+          <w:rStyle w:val="VerbatimChar"/>
+        </w:rPr>
+        <w:t xml:space="preserve">CM-COVENANT-114-272-PROPAGATION</w:t>
       </w:r>
       <w:r>
         <w:t xml:space="preserve"> </w:t>
@@ -43870,7 +44071,7 @@
         <w:rPr>
           <w:rStyle w:val="VerbatimChar"/>
         </w:rPr>
-        <w:t xml:space="preserve">11.4.275</w:t>
+        <w:t xml:space="preserve">11.4.272</w:t>
       </w:r>
       <w:r>
         <w:t xml:space="preserve">) + recommended gates</w:t>
@@ -43882,7 +44083,7 @@
         <w:rPr>
           <w:rStyle w:val="VerbatimChar"/>
         </w:rPr>
-        <w:t xml:space="preserve">CM-CODE-INDEX-AGENT-ACCESSIBLE</w:t>
+        <w:t xml:space="preserve">CM-SKILL-SURFACE-BUDGET</w:t>
       </w:r>
       <w:r>
         <w:t xml:space="preserve"> </w:t>
@@ -43897,7 +44098,7 @@
         <w:rPr>
           <w:rStyle w:val="VerbatimChar"/>
         </w:rPr>
-        <w:t xml:space="preserve">CM-CODE-INDEX-COMPLETE-BEFORE-READY</w:t>
+        <w:t xml:space="preserve">CM-SKILL-ACTIVATION-FAIL-SAFE</w:t>
       </w:r>
       <w:r>
         <w:t xml:space="preserve"> </w:t>
@@ -43912,118 +44113,13 @@
         <w:rPr>
           <w:rStyle w:val="VerbatimChar"/>
         </w:rPr>
-        <w:t xml:space="preserve">CM-LUMEN-MODEL-PROVEN</w:t>
-      </w:r>
-      <w:r>
-        <w:t xml:space="preserve"> </w:t>
-      </w:r>
-      <w:r>
-        <w:t xml:space="preserve">/</w:t>
-      </w:r>
-      <w:r>
-        <w:t xml:space="preserve"> </w:t>
-      </w:r>
-      <w:r>
-        <w:rPr>
-          <w:rStyle w:val="VerbatimChar"/>
-        </w:rPr>
-        <w:t xml:space="preserve">CM-LUMEN-SCOPED-FRESH</w:t>
-      </w:r>
-      <w:r>
-        <w:t xml:space="preserve"> </w:t>
-      </w:r>
-      <w:r>
-        <w:t xml:space="preserve">/</w:t>
-      </w:r>
-      <w:r>
-        <w:t xml:space="preserve"> </w:t>
-      </w:r>
-      <w:r>
-        <w:rPr>
-          <w:rStyle w:val="VerbatimChar"/>
-        </w:rPr>
-        <w:t xml:space="preserve">CM-CODE-INDEX-BENCH</w:t>
-      </w:r>
-      <w:r>
-        <w:t xml:space="preserve"> </w:t>
-      </w:r>
-      <w:r>
-        <w:t xml:space="preserve">/</w:t>
-      </w:r>
-      <w:r>
-        <w:t xml:space="preserve"> </w:t>
-      </w:r>
-      <w:r>
-        <w:rPr>
-          <w:rStyle w:val="VerbatimChar"/>
-        </w:rPr>
-        <w:t xml:space="preserve">CM-CODEGRAPH-SCOPE-PROOF</w:t>
-      </w:r>
-      <w:r>
-        <w:t xml:space="preserve"> </w:t>
-      </w:r>
-      <w:r>
-        <w:t xml:space="preserve">/</w:t>
-      </w:r>
-      <w:r>
-        <w:t xml:space="preserve"> </w:t>
-      </w:r>
-      <w:r>
-        <w:rPr>
-          <w:rStyle w:val="VerbatimChar"/>
-        </w:rPr>
-        <w:t xml:space="preserve">CM-CODEGRAPH-UPGRADE-PROBE-GATED</w:t>
-      </w:r>
-      <w:r>
-        <w:t xml:space="preserve"> </w:t>
-      </w:r>
-      <w:r>
-        <w:t xml:space="preserve">/</w:t>
-      </w:r>
-      <w:r>
-        <w:t xml:space="preserve"> </w:t>
-      </w:r>
-      <w:r>
-        <w:rPr>
-          <w:rStyle w:val="VerbatimChar"/>
-        </w:rPr>
-        <w:t xml:space="preserve">CM-CODEGRAPH-WRITER-EXCLUSIVE</w:t>
-      </w:r>
-      <w:r>
-        <w:t xml:space="preserve"> </w:t>
-      </w:r>
-      <w:r>
-        <w:t xml:space="preserve">/</w:t>
-      </w:r>
-      <w:r>
-        <w:t xml:space="preserve"> </w:t>
-      </w:r>
-      <w:r>
-        <w:rPr>
-          <w:rStyle w:val="VerbatimChar"/>
-        </w:rPr>
-        <w:t xml:space="preserve">CM-CODEGRAPH-BULK-BY-BACKLOG</w:t>
-      </w:r>
-      <w:r>
-        <w:t xml:space="preserve"> </w:t>
-      </w:r>
-      <w:r>
-        <w:t xml:space="preserve">/</w:t>
-      </w:r>
-      <w:r>
-        <w:t xml:space="preserve"> </w:t>
-      </w:r>
-      <w:r>
-        <w:rPr>
-          <w:rStyle w:val="VerbatimChar"/>
-        </w:rPr>
-        <w:t xml:space="preserve">CM-CODEGRAPH-STALL-WATCHDOG</w:t>
-      </w:r>
-      <w:r>
-        <w:t xml:space="preserve"> </w:t>
-      </w:r>
-      <w:r>
-        <w:t xml:space="preserve">+ paired §1.1 mutations (enabled-undeclared server, ready with pending &gt; 0, reduction without wrong-answer list, unloaded model, bulk-by-rows, dropped liveness check → each gate MUST FAIL; golden-FALSE: unchanged complete reachable index fires none). Gate CODE = separate work item, NOT claimed shipped (§11.4.6 / §11.4.227).</w:t>
+        <w:t xml:space="preserve">CM-SKILL-PRUNE-PRESERVES-CONTENT</w:t>
+      </w:r>
+      <w:r>
+        <w:t xml:space="preserve"> </w:t>
+      </w:r>
+      <w:r>
+        <w:t xml:space="preserve">+ paired §1.1 mutation (squeeze the budget below the real surface, break an activation target, remove the engine without the distinct engine-absent exit code, or make a demotion destructive/strip its relocation-safety or other-live-session check → the gates MUST FAIL). Gate-code beyond the shipped scripts = separate work item, NOT claimed shipped (§11.4.6/§11.4.227).</w:t>
       </w:r>
       <w:r>
         <w:t xml:space="preserve"> </w:t>
@@ -44056,6 +44152,834 @@
         <w:t xml:space="preserve"> </w:t>
       </w:r>
       <w:r>
+        <w:t xml:space="preserve">§11.4.272. Non-compliance is a release blocker. No escape hatch — no</w:t>
+      </w:r>
+      <w:r>
+        <w:t xml:space="preserve"> </w:t>
+      </w:r>
+      <w:r>
+        <w:rPr>
+          <w:rStyle w:val="VerbatimChar"/>
+        </w:rPr>
+        <w:t xml:space="preserve">--all-skills-always-on</w:t>
+      </w:r>
+      <w:r>
+        <w:t xml:space="preserve">,</w:t>
+      </w:r>
+      <w:r>
+        <w:t xml:space="preserve"> </w:t>
+      </w:r>
+      <w:r>
+        <w:rPr>
+          <w:rStyle w:val="VerbatimChar"/>
+        </w:rPr>
+        <w:t xml:space="preserve">--skip-activation-engine</w:t>
+      </w:r>
+      <w:r>
+        <w:t xml:space="preserve">,</w:t>
+      </w:r>
+      <w:r>
+        <w:t xml:space="preserve"> </w:t>
+      </w:r>
+      <w:r>
+        <w:rPr>
+          <w:rStyle w:val="VerbatimChar"/>
+        </w:rPr>
+        <w:t xml:space="preserve">--hide-inactive-skills</w:t>
+      </w:r>
+      <w:r>
+        <w:t xml:space="preserve">,</w:t>
+      </w:r>
+      <w:r>
+        <w:t xml:space="preserve"> </w:t>
+      </w:r>
+      <w:r>
+        <w:rPr>
+          <w:rStyle w:val="VerbatimChar"/>
+        </w:rPr>
+        <w:t xml:space="preserve">--silent-activation-failure</w:t>
+      </w:r>
+      <w:r>
+        <w:t xml:space="preserve">,</w:t>
+      </w:r>
+      <w:r>
+        <w:t xml:space="preserve"> </w:t>
+      </w:r>
+      <w:r>
+        <w:rPr>
+          <w:rStyle w:val="VerbatimChar"/>
+        </w:rPr>
+        <w:t xml:space="preserve">--ignore-surface-budget</w:t>
+      </w:r>
+      <w:r>
+        <w:t xml:space="preserve">,</w:t>
+      </w:r>
+      <w:r>
+        <w:t xml:space="preserve"> </w:t>
+      </w:r>
+      <w:r>
+        <w:rPr>
+          <w:rStyle w:val="VerbatimChar"/>
+        </w:rPr>
+        <w:t xml:space="preserve">--assume-skill-loaded</w:t>
+      </w:r>
+      <w:r>
+        <w:t xml:space="preserve"> </w:t>
+      </w:r>
+      <w:r>
+        <w:t xml:space="preserve">flag.</w:t>
+      </w:r>
+    </w:p>
+    <w:p>
+      <w:pPr>
+        <w:pStyle w:val="BodyText"/>
+      </w:pPr>
+      <w:r>
+        <w:rPr>
+          <w:b/>
+          <w:bCs/>
+        </w:rPr>
+        <w:t xml:space="preserve">§11.4.273 — Measuring-instrument verification: a census that INFORMS a decision must be control-needled before its result is believed (research-derived, 2026-09-08).</w:t>
+      </w:r>
+      <w:r>
+        <w:t xml:space="preserve"> </w:t>
+      </w:r>
+      <w:r>
+        <w:t xml:space="preserve">Compact summary: forensic anchor — FIFTEEN distinct ad-hoc-measurement instrument failures in one working session (2026-09-08), each returning a confident, plausible, actionable-looking result that was an artefact of the instrument, not a property of the system: a block-opener regex missing a second heading form manufactured 24 phantom dangling anchors;</w:t>
+      </w:r>
+      <w:r>
+        <w:t xml:space="preserve"> </w:t>
+      </w:r>
+      <w:r>
+        <w:rPr>
+          <w:rStyle w:val="VerbatimChar"/>
+        </w:rPr>
+        <w:t xml:space="preserve">comm</w:t>
+      </w:r>
+      <w:r>
+        <w:t xml:space="preserve"> </w:t>
+      </w:r>
+      <w:r>
+        <w:t xml:space="preserve">on non-lexicographically-sorted input reported all 34 anchors missing from a file containing none missing;</w:t>
+      </w:r>
+      <w:r>
+        <w:t xml:space="preserve"> </w:t>
+      </w:r>
+      <w:r>
+        <w:rPr>
+          <w:rStyle w:val="VerbatimChar"/>
+        </w:rPr>
+        <w:t xml:space="preserve">$?</w:t>
+      </w:r>
+      <w:r>
+        <w:t xml:space="preserve"> </w:t>
+      </w:r>
+      <w:r>
+        <w:t xml:space="preserve">read after a pipeline reported the pipeline's LAST stage, turning exit 1 into reported exit 0; a field-name typo returned</w:t>
+      </w:r>
+      <w:r>
+        <w:t xml:space="preserve"> </w:t>
+      </w:r>
+      <w:r>
+        <w:rPr>
+          <w:rStyle w:val="VerbatimChar"/>
+        </w:rPr>
+        <w:t xml:space="preserve">&lt;none&gt;</w:t>
+      </w:r>
+      <w:r>
+        <w:t xml:space="preserve"> </w:t>
+      </w:r>
+      <w:r>
+        <w:t xml:space="preserve">for every record;</w:t>
+      </w:r>
+      <w:r>
+        <w:t xml:space="preserve"> </w:t>
+      </w:r>
+      <w:r>
+        <w:rPr>
+          <w:rStyle w:val="VerbatimChar"/>
+        </w:rPr>
+        <w:t xml:space="preserve">grep -w</w:t>
+      </w:r>
+      <w:r>
+        <w:t xml:space="preserve"> </w:t>
+      </w:r>
+      <w:r>
+        <w:t xml:space="preserve">treated</w:t>
+      </w:r>
+      <w:r>
+        <w:t xml:space="preserve"> </w:t>
+      </w:r>
+      <w:r>
+        <w:rPr>
+          <w:rStyle w:val="VerbatimChar"/>
+        </w:rPr>
+        <w:t xml:space="preserve">-</w:t>
+      </w:r>
+      <w:r>
+        <w:t xml:space="preserve"> </w:t>
+      </w:r>
+      <w:r>
+        <w:t xml:space="preserve">as a word boundary and silently reclassified a record; a summary-line grep assumed field order that flips on failure, reading a real failure as merely quiet;</w:t>
+      </w:r>
+      <w:r>
+        <w:t xml:space="preserve"> </w:t>
+      </w:r>
+      <w:r>
+        <w:rPr>
+          <w:rStyle w:val="VerbatimChar"/>
+        </w:rPr>
+        <w:t xml:space="preserve">while read</w:t>
+      </w:r>
+      <w:r>
+        <w:t xml:space="preserve"> </w:t>
+      </w:r>
+      <w:r>
+        <w:t xml:space="preserve">silently dropped a final no-trailing-newline line; a mutation was applied via the WRONG env knob so the real (unmutated) tree was tested and the green was meaningless; a guard-probe used a command the guard does not target, proving nothing either way; a test fixture aliased two columns to the same string so a real column-swap mutation survived 52/0 undetected; a positive control chosen OUTSIDE the instrument's declared scope reported a working instrument as broken; a positive control that WAS the very question under test could not discriminate anything; an</w:t>
+      </w:r>
+      <w:r>
+        <w:t xml:space="preserve"> </w:t>
+      </w:r>
+      <w:r>
+        <w:rPr>
+          <w:rStyle w:val="VerbatimChar"/>
+        </w:rPr>
+        <w:t xml:space="preserve">awk</w:t>
+      </w:r>
+      <w:r>
+        <w:t xml:space="preserve"> </w:t>
+      </w:r>
+      <w:r>
+        <w:t xml:space="preserve">range mis-escape reported 838 rows where the live system held 134 (6x wrong), nearly gating a destructive DB recreate; a denylist with TWO needles was searched with only ONE, so "zero remaining" was blind to the first while a live credential was still present in four copy-pasteable lines per file;</w:t>
+      </w:r>
+      <w:r>
+        <w:t xml:space="preserve"> </w:t>
+      </w:r>
+      <w:r>
+        <w:rPr>
+          <w:rStyle w:val="VerbatimChar"/>
+        </w:rPr>
+        <w:t xml:space="preserve">$?</w:t>
+      </w:r>
+      <w:r>
+        <w:t xml:space="preserve"> </w:t>
+      </w:r>
+      <w:r>
+        <w:t xml:space="preserve">was clobbered by a command substitution sitting earlier in the SAME statement, reporting a failed</w:t>
+      </w:r>
+      <w:r>
+        <w:t xml:space="preserve"> </w:t>
+      </w:r>
+      <w:r>
+        <w:rPr>
+          <w:rStyle w:val="VerbatimChar"/>
+        </w:rPr>
+        <w:t xml:space="preserve">pandoc</w:t>
+      </w:r>
+      <w:r>
+        <w:t xml:space="preserve"> </w:t>
+      </w:r>
+      <w:r>
+        <w:t xml:space="preserve">run (exit 64, nothing written) as exit=0. The gap: §11.4.201 governs guards/gates (block/pass), §11.4.107(10) governs calibrated analyzers — neither covers the far more common ad-hoc census (a grep, a set-diff, an exit-code read, a field lookup, a row count) whose output is a FACT a decision/fix/classification/report is then built on, written inline, used once, trusted implicitly, never itself tested. The mandate: any decision/claim/classification/report-bearing measurement MUST be control-needled BEFORE acting on or communicating its result — (a) POSITIVE control (a known-present value must be found, catching too-narrow patterns/wrong fields/wrong knobs/silent no-output stages); (b) NEGATIVE control (a known-absent fabricated needle must NOT be found, catching too-broad patterns/accidental substring-or-word-boundary matches); (c) an EMPTY result is NEVER a finding on its own — genuinely-absent / instrument-blind / wrong-location / wrong-output-shape are four distinct states an empty result cannot by itself distinguish, reportable only AFTER (a) proves the instrument can see a positive; (d) a result CONTRADICTING directly-observed evidence presumes the INSTRUMENT is at fault first; (e) the instrument that established a FACT is itself part of the evidence — captured claims cite the producing command; (f) when the criterion is a SET (a denylist, a taxonomy, a multi-column key), the control MUST cover EVERY member — needling one member proves only that member is searchable, the instance-14 failure mode, the most dangerous on the list because both controls PASS while the answer is wrong; (g) capture an exit status BEFORE any other expansion can overwrite it — assign</w:t>
+      </w:r>
+      <w:r>
+        <w:t xml:space="preserve"> </w:t>
+      </w:r>
+      <w:r>
+        <w:rPr>
+          <w:rStyle w:val="VerbatimChar"/>
+        </w:rPr>
+        <w:t xml:space="preserve">$?</w:t>
+      </w:r>
+      <w:r>
+        <w:t xml:space="preserve"> </w:t>
+      </w:r>
+      <w:r>
+        <w:t xml:space="preserve">to a variable on its own line immediately after the command, never read it after a pipeline or a same-statement command substitution. Honest boundary (§11.4.6): control needles prove an instrument distinguishes present-from-absent, never that it measures the RIGHT property, and never that it is correct for inputs unlike the needles chosen. Classification: universal (§11.4.17). Composes §11.4.2/§11.4.5/§11.4.6/§11.4.107(10)/§11.4.118/§11.4.201/§1.1. Propagation gate</w:t>
+      </w:r>
+      <w:r>
+        <w:t xml:space="preserve"> </w:t>
+      </w:r>
+      <w:r>
+        <w:rPr>
+          <w:rStyle w:val="VerbatimChar"/>
+        </w:rPr>
+        <w:t xml:space="preserve">CM-COVENANT-114-273-PROPAGATION</w:t>
+      </w:r>
+      <w:r>
+        <w:t xml:space="preserve"> </w:t>
+      </w:r>
+      <w:r>
+        <w:t xml:space="preserve">(literal</w:t>
+      </w:r>
+      <w:r>
+        <w:t xml:space="preserve"> </w:t>
+      </w:r>
+      <w:r>
+        <w:rPr>
+          <w:rStyle w:val="VerbatimChar"/>
+        </w:rPr>
+        <w:t xml:space="preserve">11.4.273</w:t>
+      </w:r>
+      <w:r>
+        <w:t xml:space="preserve">) + recommended gate</w:t>
+      </w:r>
+      <w:r>
+        <w:t xml:space="preserve"> </w:t>
+      </w:r>
+      <w:r>
+        <w:rPr>
+          <w:rStyle w:val="VerbatimChar"/>
+        </w:rPr>
+        <w:t xml:space="preserve">CM-CENSUS-CONTROL-NEEDLED</w:t>
+      </w:r>
+      <w:r>
+        <w:t xml:space="preserve"> </w:t>
+      </w:r>
+      <w:r>
+        <w:t xml:space="preserve">(a decision-bearing census cites its positive and negative control) + paired §1.1 mutation (accept a decision-bearing census with no control → the gate MUST FAIL). Gate-code = separate work item, NOT claimed shipped (§11.4.6/§11.4.227).</w:t>
+      </w:r>
+      <w:r>
+        <w:t xml:space="preserve"> </w:t>
+      </w:r>
+      <w:r>
+        <w:rPr>
+          <w:b/>
+          <w:bCs/>
+        </w:rPr>
+        <w:t xml:space="preserve">Canonical authority:</w:t>
+      </w:r>
+      <w:r>
+        <w:t xml:space="preserve"> </w:t>
+      </w:r>
+      <w:r>
+        <w:t xml:space="preserve">constitution submodule</w:t>
+      </w:r>
+      <w:r>
+        <w:t xml:space="preserve"> </w:t>
+      </w:r>
+      <w:hyperlink r:id="rId69">
+        <w:r>
+          <w:rPr>
+            <w:rStyle w:val="VerbatimChar"/>
+          </w:rPr>
+          <w:t xml:space="preserve">Constitution.md</w:t>
+        </w:r>
+      </w:hyperlink>
+      <w:r>
+        <w:t xml:space="preserve"> </w:t>
+      </w:r>
+      <w:r>
+        <w:t xml:space="preserve">§11.4.273. Non-compliance is a release blocker. No escape hatch — no</w:t>
+      </w:r>
+      <w:r>
+        <w:t xml:space="preserve"> </w:t>
+      </w:r>
+      <w:r>
+        <w:rPr>
+          <w:rStyle w:val="VerbatimChar"/>
+        </w:rPr>
+        <w:t xml:space="preserve">--skip-control-needle</w:t>
+      </w:r>
+      <w:r>
+        <w:t xml:space="preserve">,</w:t>
+      </w:r>
+      <w:r>
+        <w:t xml:space="preserve"> </w:t>
+      </w:r>
+      <w:r>
+        <w:rPr>
+          <w:rStyle w:val="VerbatimChar"/>
+        </w:rPr>
+        <w:t xml:space="preserve">--empty-is-absent</w:t>
+      </w:r>
+      <w:r>
+        <w:t xml:space="preserve">,</w:t>
+      </w:r>
+      <w:r>
+        <w:t xml:space="preserve"> </w:t>
+      </w:r>
+      <w:r>
+        <w:rPr>
+          <w:rStyle w:val="VerbatimChar"/>
+        </w:rPr>
+        <w:t xml:space="preserve">--trust-the-grep</w:t>
+      </w:r>
+      <w:r>
+        <w:t xml:space="preserve">,</w:t>
+      </w:r>
+      <w:r>
+        <w:t xml:space="preserve"> </w:t>
+      </w:r>
+      <w:r>
+        <w:rPr>
+          <w:rStyle w:val="VerbatimChar"/>
+        </w:rPr>
+        <w:t xml:space="preserve">--census-needs-no-proof</w:t>
+      </w:r>
+      <w:r>
+        <w:t xml:space="preserve">,</w:t>
+      </w:r>
+      <w:r>
+        <w:t xml:space="preserve"> </w:t>
+      </w:r>
+      <w:r>
+        <w:rPr>
+          <w:rStyle w:val="VerbatimChar"/>
+        </w:rPr>
+        <w:t xml:space="preserve">--obvious-result-exempt</w:t>
+      </w:r>
+      <w:r>
+        <w:t xml:space="preserve">,</w:t>
+      </w:r>
+      <w:r>
+        <w:t xml:space="preserve"> </w:t>
+      </w:r>
+      <w:r>
+        <w:rPr>
+          <w:rStyle w:val="VerbatimChar"/>
+        </w:rPr>
+        <w:t xml:space="preserve">--one-needle-covers-the-set</w:t>
+      </w:r>
+      <w:r>
+        <w:t xml:space="preserve">,</w:t>
+      </w:r>
+      <w:r>
+        <w:t xml:space="preserve"> </w:t>
+      </w:r>
+      <w:r>
+        <w:rPr>
+          <w:rStyle w:val="VerbatimChar"/>
+        </w:rPr>
+        <w:t xml:space="preserve">--read-status-after-substitution</w:t>
+      </w:r>
+      <w:r>
+        <w:t xml:space="preserve"> </w:t>
+      </w:r>
+      <w:r>
+        <w:t xml:space="preserve">flag.</w:t>
+      </w:r>
+    </w:p>
+    <w:p>
+      <w:pPr>
+        <w:pStyle w:val="BodyText"/>
+      </w:pPr>
+      <w:r>
+        <w:rPr>
+          <w:b/>
+          <w:bCs/>
+        </w:rPr>
+        <w:t xml:space="preserve">§11.4.274 — Mechanical work belongs in a script, not in an agent's context: extract it, test it, and re-scan for it on a cadence (User mandate, 2026-09-08).</w:t>
+      </w:r>
+      <w:r>
+        <w:t xml:space="preserve"> </w:t>
+      </w:r>
+      <w:r>
+        <w:t xml:space="preserve">Compact summary: forensic anchor — in one working session five independent review agents consumed roughly 400,000–450,000 tokens EACH, with the dominant cost being MECHANICS (copy a tree to scratch, apply a one-line mutation, run a suite, read the summary, restore, verify the restore byte-identical, compare counts, repeat per mutation) — a deterministic, fixed-input/fixed-output, zero-judgment loop executed one tool call at a time by a language model at roughly four orders of magnitude the cost of a script, with a fresh transcription-error opportunity at every step (the session recorded ten such instrument errors, §11.4.273). The rule: work that is DETERMINISTIC, REPEATABLE and contains NO JUDGMENT MUST be delegated to a properly written script/utility and invoked, never performed turn-by-turn inside an agent's context — concretely mutation apply/run/restore/verify loops, suite fan-outs + result tabulation, before/after comparisons, scratch-tree setup/teardown, residue/quiescence scans, census/inventory queries, artifact fingerprinting, evidence collection/layout, and any already-fixed recipe. (a) EXTRACT — a mechanical sequence performed by hand more than twice is a tooling defect, not a task; the bar is behavioural (if the steps can be written down exactly, they can be executed exactly, and hand-execution is the wrong instrument). (b) THE EXTRACTED TOOL IS ITSELF GOVERNED — ships documentation (§11.4.18), an operator-facing guide where applicable, and tests proving its behaviour + failure paths + exit-code semantics (§11.4.201) + its own control needles (§11.4.273) with deterministic machine evidence (§11.4.50/§11.4.5); a fast-but-unproven extraction is a regression, not an optimisation. (c) RE-SCAN ON A CADENCE — every project periodically scans itself (transcripts/logs/repeated inline recipes/"run these commands in order" docs) for mechanical work still performed by agents and refactors it out; a STANDING recurring obligation, never a one-off cleanup. (d) HONEST BOUNDARY (§11.4.6) — JUDGMENT MUST NOT be scripted: root-cause determination (§11.4.102), review verdicts (§11.4.125/§11.4.142/§11.4.194), the decision a fix is correct, the choice of what to measure, whether captured evidence actually supports a claim — a script that renders a verdict is itself a bluff gate (§11.4.201); the division is SCRIPT gathers+executes deterministically and cheaply, AGENT decides what it means; cost is never a reason to move a decision into a script. Classification: universal (§11.4.17). Composes §11.4.5/§11.4.18/§11.4.50/§11.4.124/§11.4.141/§11.4.201/§11.4.273/§1.1. Propagation gate</w:t>
+      </w:r>
+      <w:r>
+        <w:t xml:space="preserve"> </w:t>
+      </w:r>
+      <w:r>
+        <w:rPr>
+          <w:rStyle w:val="VerbatimChar"/>
+        </w:rPr>
+        <w:t xml:space="preserve">CM-COVENANT-114-274-PROPAGATION</w:t>
+      </w:r>
+      <w:r>
+        <w:t xml:space="preserve"> </w:t>
+      </w:r>
+      <w:r>
+        <w:t xml:space="preserve">(literal</w:t>
+      </w:r>
+      <w:r>
+        <w:t xml:space="preserve"> </w:t>
+      </w:r>
+      <w:r>
+        <w:rPr>
+          <w:rStyle w:val="VerbatimChar"/>
+        </w:rPr>
+        <w:t xml:space="preserve">11.4.274</w:t>
+      </w:r>
+      <w:r>
+        <w:t xml:space="preserve">) + recommended gates</w:t>
+      </w:r>
+      <w:r>
+        <w:t xml:space="preserve"> </w:t>
+      </w:r>
+      <w:r>
+        <w:rPr>
+          <w:rStyle w:val="VerbatimChar"/>
+        </w:rPr>
+        <w:t xml:space="preserve">CM-MECHANICAL-WORK-EXTRACTED</w:t>
+      </w:r>
+      <w:r>
+        <w:t xml:space="preserve"> </w:t>
+      </w:r>
+      <w:r>
+        <w:t xml:space="preserve">(a hand-performed mechanical sequence used more than twice has an extraction item) /</w:t>
+      </w:r>
+      <w:r>
+        <w:t xml:space="preserve"> </w:t>
+      </w:r>
+      <w:r>
+        <w:rPr>
+          <w:rStyle w:val="VerbatimChar"/>
+        </w:rPr>
+        <w:t xml:space="preserve">CM-EXTRACTED-TOOL-DOCUMENTED-AND-TESTED</w:t>
+      </w:r>
+      <w:r>
+        <w:t xml:space="preserve"> </w:t>
+      </w:r>
+      <w:r>
+        <w:t xml:space="preserve">(every extracted tool carries docs + tests + deterministic machine evidence) + paired §1.1 mutation. Gate-code = separate work item, NOT claimed shipped (§11.4.6/§11.4.227).</w:t>
+      </w:r>
+      <w:r>
+        <w:t xml:space="preserve"> </w:t>
+      </w:r>
+      <w:r>
+        <w:rPr>
+          <w:b/>
+          <w:bCs/>
+        </w:rPr>
+        <w:t xml:space="preserve">Canonical authority:</w:t>
+      </w:r>
+      <w:r>
+        <w:t xml:space="preserve"> </w:t>
+      </w:r>
+      <w:r>
+        <w:t xml:space="preserve">constitution submodule</w:t>
+      </w:r>
+      <w:r>
+        <w:t xml:space="preserve"> </w:t>
+      </w:r>
+      <w:hyperlink r:id="rId69">
+        <w:r>
+          <w:rPr>
+            <w:rStyle w:val="VerbatimChar"/>
+          </w:rPr>
+          <w:t xml:space="preserve">Constitution.md</w:t>
+        </w:r>
+      </w:hyperlink>
+      <w:r>
+        <w:t xml:space="preserve"> </w:t>
+      </w:r>
+      <w:r>
+        <w:t xml:space="preserve">§11.4.274. Non-compliance is a release blocker. No escape hatch — no</w:t>
+      </w:r>
+      <w:r>
+        <w:t xml:space="preserve"> </w:t>
+      </w:r>
+      <w:r>
+        <w:rPr>
+          <w:rStyle w:val="VerbatimChar"/>
+        </w:rPr>
+        <w:t xml:space="preserve">--skip-extraction</w:t>
+      </w:r>
+      <w:r>
+        <w:t xml:space="preserve">,</w:t>
+      </w:r>
+      <w:r>
+        <w:t xml:space="preserve"> </w:t>
+      </w:r>
+      <w:r>
+        <w:rPr>
+          <w:rStyle w:val="VerbatimChar"/>
+        </w:rPr>
+        <w:t xml:space="preserve">--agent-can-do-it</w:t>
+      </w:r>
+      <w:r>
+        <w:t xml:space="preserve">,</w:t>
+      </w:r>
+      <w:r>
+        <w:t xml:space="preserve"> </w:t>
+      </w:r>
+      <w:r>
+        <w:rPr>
+          <w:rStyle w:val="VerbatimChar"/>
+        </w:rPr>
+        <w:t xml:space="preserve">--one-off-is-fine</w:t>
+      </w:r>
+      <w:r>
+        <w:t xml:space="preserve">,</w:t>
+      </w:r>
+      <w:r>
+        <w:t xml:space="preserve"> </w:t>
+      </w:r>
+      <w:r>
+        <w:rPr>
+          <w:rStyle w:val="VerbatimChar"/>
+        </w:rPr>
+        <w:t xml:space="preserve">--script-the-review</w:t>
+      </w:r>
+      <w:r>
+        <w:t xml:space="preserve">,</w:t>
+      </w:r>
+      <w:r>
+        <w:t xml:space="preserve"> </w:t>
+      </w:r>
+      <w:r>
+        <w:rPr>
+          <w:rStyle w:val="VerbatimChar"/>
+        </w:rPr>
+        <w:t xml:space="preserve">--extract-without-tests</w:t>
+      </w:r>
+      <w:r>
+        <w:t xml:space="preserve"> </w:t>
+      </w:r>
+      <w:r>
+        <w:t xml:space="preserve">flag.</w:t>
+      </w:r>
+    </w:p>
+    <w:p>
+      <w:pPr>
+        <w:pStyle w:val="BodyText"/>
+      </w:pPr>
+      <w:r>
+        <w:rPr>
+          <w:b/>
+          <w:bCs/>
+        </w:rPr>
+        <w:t xml:space="preserve">§11.4.275 — Semantic (Lumen) index + indexing-efficiency gate + universal agent/subagent accessibility (research-derived, 2026-09-24).</w:t>
+      </w:r>
+      <w:r>
+        <w:t xml:space="preserve"> </w:t>
+      </w:r>
+      <w:r>
+        <w:t xml:space="preserve">Compact summary: every code index the project maintains — the structural CodeGraph index (§11.4.78) AND the semantic Lumen index, and any future code index — MUST (A) be reachable by EVERY agent AND every dispatched subagent through a server definition they can actually resolve (committed project config or installed plugin); a config that ENABLES a server nothing DECLARES is a violation; proof = a real tool call from a dispatched subagent returning an index-only fact (§11.4.78(4) unforgeable challenge), un-drivable agents = documented §11.4.3 SKIP; (B) for the semantic index: embedding model provisioned rootless (§11.4.161) and proven by a real embed call returning the declared dimensions, scope GENERATED from the same class source as the structural scope (</w:t>
+      </w:r>
+      <w:r>
+        <w:rPr>
+          <w:rStyle w:val="VerbatimChar"/>
+        </w:rPr>
+        <w:t xml:space="preserve">&lt;constitution&gt;/scripts/lumen/gen_lumenignore.py</w:t>
+      </w:r>
+      <w:r>
+        <w:t xml:space="preserve">), health = files AND chunks non-zero + known-symbol hit + negative control + freshness within consumer TTL; (C) be called ready ONLY when pending work == 0, state complete, file count within consumer tolerance of the accepted count, schema indexes present — every count/empty result control-needled (§11.4.273); (D) earn its place by a DETERMINISTIC benchmark (fixed queries + golden answers, index route vs grep+read, N≥3 identical canonical hashes per §11.4.50, bytes/est-tokens/p50/p95/correctness per query), reduction computed ONLY over queries both routes answered correctly, wrong answers listed BY ID and never averaged away, thresholds = consumer DATA (§11.4.35); (E) route structural→CodeGraph, conceptual→Lumen before grep+read (§11.4.141) except measured-wrong query classes (fall back + tracked); (F) root-cause + patch performance defects in the version-keyed runner with RED→GREEN + paired mutation + byte-copy equivalence proof; (G) writes via the single writer entry (§11.4.80(5)), live reads read-only. Forensic FACTS (genericised): a configured semantic server reported 0 files / no model / never indexed; the structural index cut tokens 69.2% over 8 both-correct fixture queries yet answered 5 of 15 fixture queries WRONG (grep+read 2 of 15); one uncached full-table file-list query was 93.4% of resolve time; an FK-cascade stalled the bulk window; a launcher classifying</w:t>
+      </w:r>
+      <w:r>
+        <w:t xml:space="preserve"> </w:t>
+      </w:r>
+      <w:r>
+        <w:rPr>
+          <w:rStyle w:val="VerbatimChar"/>
+        </w:rPr>
+        <w:t xml:space="preserve">sync</w:t>
+      </w:r>
+      <w:r>
+        <w:t xml:space="preserve"> </w:t>
+      </w:r>
+      <w:r>
+        <w:t xml:space="preserve">by stored rows instead of pending backlog ran a tens-of-millions-reference bulk job stock + foreground + unsupervised; the vendor reaps locks by age not liveness and a writable open recreates dropped indexes without the lock; an errored instrument's empty result was nearly read as absence. Latent binding (§11.4.96 pattern): a project with no semantic index is bound only for the indexes it maintains; the semantic clauses bind the moment it adds one. Honest boundary (§11.4.6): proves reachable/complete/scoped/measured, not every answer correct; never licenses narrowing scope to hit a threshold (§11.4.66); the reference benchmark harness is still a prototype outside the constitution tree (landing = owed work). Classification: universal (§11.4.17). Propagation gate</w:t>
+      </w:r>
+      <w:r>
+        <w:t xml:space="preserve"> </w:t>
+      </w:r>
+      <w:r>
+        <w:rPr>
+          <w:rStyle w:val="VerbatimChar"/>
+        </w:rPr>
+        <w:t xml:space="preserve">CM-COVENANT-114-275-PROPAGATION</w:t>
+      </w:r>
+      <w:r>
+        <w:t xml:space="preserve"> </w:t>
+      </w:r>
+      <w:r>
+        <w:t xml:space="preserve">(literal</w:t>
+      </w:r>
+      <w:r>
+        <w:t xml:space="preserve"> </w:t>
+      </w:r>
+      <w:r>
+        <w:rPr>
+          <w:rStyle w:val="VerbatimChar"/>
+        </w:rPr>
+        <w:t xml:space="preserve">11.4.275</w:t>
+      </w:r>
+      <w:r>
+        <w:t xml:space="preserve">) + recommended gates</w:t>
+      </w:r>
+      <w:r>
+        <w:t xml:space="preserve"> </w:t>
+      </w:r>
+      <w:r>
+        <w:rPr>
+          <w:rStyle w:val="VerbatimChar"/>
+        </w:rPr>
+        <w:t xml:space="preserve">CM-CODE-INDEX-AGENT-ACCESSIBLE</w:t>
+      </w:r>
+      <w:r>
+        <w:t xml:space="preserve"> </w:t>
+      </w:r>
+      <w:r>
+        <w:t xml:space="preserve">/</w:t>
+      </w:r>
+      <w:r>
+        <w:t xml:space="preserve"> </w:t>
+      </w:r>
+      <w:r>
+        <w:rPr>
+          <w:rStyle w:val="VerbatimChar"/>
+        </w:rPr>
+        <w:t xml:space="preserve">CM-CODE-INDEX-COMPLETE-BEFORE-READY</w:t>
+      </w:r>
+      <w:r>
+        <w:t xml:space="preserve"> </w:t>
+      </w:r>
+      <w:r>
+        <w:t xml:space="preserve">/</w:t>
+      </w:r>
+      <w:r>
+        <w:t xml:space="preserve"> </w:t>
+      </w:r>
+      <w:r>
+        <w:rPr>
+          <w:rStyle w:val="VerbatimChar"/>
+        </w:rPr>
+        <w:t xml:space="preserve">CM-LUMEN-MODEL-PROVEN</w:t>
+      </w:r>
+      <w:r>
+        <w:t xml:space="preserve"> </w:t>
+      </w:r>
+      <w:r>
+        <w:t xml:space="preserve">/</w:t>
+      </w:r>
+      <w:r>
+        <w:t xml:space="preserve"> </w:t>
+      </w:r>
+      <w:r>
+        <w:rPr>
+          <w:rStyle w:val="VerbatimChar"/>
+        </w:rPr>
+        <w:t xml:space="preserve">CM-LUMEN-SCOPED-FRESH</w:t>
+      </w:r>
+      <w:r>
+        <w:t xml:space="preserve"> </w:t>
+      </w:r>
+      <w:r>
+        <w:t xml:space="preserve">/</w:t>
+      </w:r>
+      <w:r>
+        <w:t xml:space="preserve"> </w:t>
+      </w:r>
+      <w:r>
+        <w:rPr>
+          <w:rStyle w:val="VerbatimChar"/>
+        </w:rPr>
+        <w:t xml:space="preserve">CM-CODE-INDEX-BENCH</w:t>
+      </w:r>
+      <w:r>
+        <w:t xml:space="preserve"> </w:t>
+      </w:r>
+      <w:r>
+        <w:t xml:space="preserve">/</w:t>
+      </w:r>
+      <w:r>
+        <w:t xml:space="preserve"> </w:t>
+      </w:r>
+      <w:r>
+        <w:rPr>
+          <w:rStyle w:val="VerbatimChar"/>
+        </w:rPr>
+        <w:t xml:space="preserve">CM-CODEGRAPH-SCOPE-PROOF</w:t>
+      </w:r>
+      <w:r>
+        <w:t xml:space="preserve"> </w:t>
+      </w:r>
+      <w:r>
+        <w:t xml:space="preserve">/</w:t>
+      </w:r>
+      <w:r>
+        <w:t xml:space="preserve"> </w:t>
+      </w:r>
+      <w:r>
+        <w:rPr>
+          <w:rStyle w:val="VerbatimChar"/>
+        </w:rPr>
+        <w:t xml:space="preserve">CM-CODEGRAPH-UPGRADE-PROBE-GATED</w:t>
+      </w:r>
+      <w:r>
+        <w:t xml:space="preserve"> </w:t>
+      </w:r>
+      <w:r>
+        <w:t xml:space="preserve">/</w:t>
+      </w:r>
+      <w:r>
+        <w:t xml:space="preserve"> </w:t>
+      </w:r>
+      <w:r>
+        <w:rPr>
+          <w:rStyle w:val="VerbatimChar"/>
+        </w:rPr>
+        <w:t xml:space="preserve">CM-CODEGRAPH-WRITER-EXCLUSIVE</w:t>
+      </w:r>
+      <w:r>
+        <w:t xml:space="preserve"> </w:t>
+      </w:r>
+      <w:r>
+        <w:t xml:space="preserve">/</w:t>
+      </w:r>
+      <w:r>
+        <w:t xml:space="preserve"> </w:t>
+      </w:r>
+      <w:r>
+        <w:rPr>
+          <w:rStyle w:val="VerbatimChar"/>
+        </w:rPr>
+        <w:t xml:space="preserve">CM-CODEGRAPH-BULK-BY-BACKLOG</w:t>
+      </w:r>
+      <w:r>
+        <w:t xml:space="preserve"> </w:t>
+      </w:r>
+      <w:r>
+        <w:t xml:space="preserve">/</w:t>
+      </w:r>
+      <w:r>
+        <w:t xml:space="preserve"> </w:t>
+      </w:r>
+      <w:r>
+        <w:rPr>
+          <w:rStyle w:val="VerbatimChar"/>
+        </w:rPr>
+        <w:t xml:space="preserve">CM-CODEGRAPH-STALL-WATCHDOG</w:t>
+      </w:r>
+      <w:r>
+        <w:t xml:space="preserve"> </w:t>
+      </w:r>
+      <w:r>
+        <w:t xml:space="preserve">+ paired §1.1 mutations (enabled-undeclared server, ready with pending &gt; 0, reduction without wrong-answer list, unloaded model, bulk-by-rows, dropped liveness check → each gate MUST FAIL; golden-FALSE: unchanged complete reachable index fires none). Gate CODE = separate work item, NOT claimed shipped (§11.4.6 / §11.4.227).</w:t>
+      </w:r>
+      <w:r>
+        <w:t xml:space="preserve"> </w:t>
+      </w:r>
+      <w:r>
+        <w:rPr>
+          <w:b/>
+          <w:bCs/>
+        </w:rPr>
+        <w:t xml:space="preserve">Canonical authority:</w:t>
+      </w:r>
+      <w:r>
+        <w:t xml:space="preserve"> </w:t>
+      </w:r>
+      <w:r>
+        <w:t xml:space="preserve">constitution submodule</w:t>
+      </w:r>
+      <w:r>
+        <w:t xml:space="preserve"> </w:t>
+      </w:r>
+      <w:hyperlink r:id="rId69">
+        <w:r>
+          <w:rPr>
+            <w:rStyle w:val="VerbatimChar"/>
+          </w:rPr>
+          <w:t xml:space="preserve">Constitution.md</w:t>
+        </w:r>
+      </w:hyperlink>
+      <w:r>
+        <w:t xml:space="preserve"> </w:t>
+      </w:r>
+      <w:r>
         <w:t xml:space="preserve">§11.4.275. Non-compliance is a release blocker. No escape hatch — no</w:t>
       </w:r>
       <w:r>
@@ -44138,6 +45062,360 @@
           <w:rStyle w:val="VerbatimChar"/>
         </w:rPr>
         <w:t xml:space="preserve">--lock-age-is-liveness</w:t>
+      </w:r>
+      <w:r>
+        <w:t xml:space="preserve"> </w:t>
+      </w:r>
+      <w:r>
+        <w:t xml:space="preserve">flag.</w:t>
+      </w:r>
+    </w:p>
+    <w:p>
+      <w:pPr>
+        <w:pStyle w:val="BodyText"/>
+      </w:pPr>
+      <w:r>
+        <w:rPr>
+          <w:b/>
+          <w:bCs/>
+        </w:rPr>
+        <w:t xml:space="preserve">§11.4.276 — Review-round budget: every independently-reviewed work item converges within a declared budget of at most 7 rounds (5–7, consumer-declared), by front-loading ground truth, class-exhaustive enumeration, real-path tests and a declared threat boundary, with a binding methodology change at round 3 (User mandate, 2026-10-05).</w:t>
+      </w:r>
+      <w:r>
+        <w:t xml:space="preserve"> </w:t>
+      </w:r>
+      <w:r>
+        <w:t xml:space="preserve">Compact summary: every item passing through the §11.4.125/§11.4.134/§11.4.142/§11.4.194 review loop carries a round budget</w:t>
+      </w:r>
+      <w:r>
+        <w:t xml:space="preserve"> </w:t>
+      </w:r>
+      <w:r>
+        <w:rPr>
+          <w:rStyle w:val="VerbatimChar"/>
+        </w:rPr>
+        <w:t xml:space="preserve">R_max</w:t>
+      </w:r>
+      <w:r>
+        <w:t xml:space="preserve"> </w:t>
+      </w:r>
+      <w:r>
+        <w:t xml:space="preserve">in the closed range 5–7 (operator-mandated ceiling, verbatim: "all work ALWAYS gets done with 5 to 7 reviews max"; absent declaration resolves to 5); this is NOT the invented-</w:t>
+      </w:r>
+      <w:r>
+        <w:rPr>
+          <w:rStyle w:val="VerbatimChar"/>
+        </w:rPr>
+        <w:t xml:space="preserve">N</w:t>
+      </w:r>
+      <w:r>
+        <w:t xml:space="preserve"> </w:t>
+      </w:r>
+      <w:r>
+        <w:t xml:space="preserve">case §11.4.267(E) forbids — the consumer's</w:t>
+      </w:r>
+      <w:r>
+        <w:t xml:space="preserve"> </w:t>
+      </w:r>
+      <w:r>
+        <w:rPr>
+          <w:rStyle w:val="VerbatimChar"/>
+        </w:rPr>
+        <w:t xml:space="preserve">R_max</w:t>
+      </w:r>
+      <w:r>
+        <w:t xml:space="preserve"> </w:t>
+      </w:r>
+      <w:r>
+        <w:t xml:space="preserve">within the operator ceiling IS §11.4.267's</w:t>
+      </w:r>
+      <w:r>
+        <w:t xml:space="preserve"> </w:t>
+      </w:r>
+      <w:r>
+        <w:rPr>
+          <w:rStyle w:val="VerbatimChar"/>
+        </w:rPr>
+        <w:t xml:space="preserve">N</w:t>
+      </w:r>
+      <w:r>
+        <w:t xml:space="preserve"> </w:t>
+      </w:r>
+      <w:r>
+        <w:t xml:space="preserve">for the review loop. Forensic root causes (five, genericised from a reference project running items to 7/10+/30/39+ rounds in one week): (1) wrong-model ground truth — a fix and its OWN verifying gate shared a simplified model of an external tool's real composition path, caught only when a reviewer read the tool's source and rebuilt the fixture on the real path; (2) instance-at-a-time closure of a known class — a security gate hardened one command name per round for three consecutive rounds after a whole-file enumeration was explicitly declined for lack of a classifier; (3) fixer-authored tests that never drive the real code — regression tests re-implementing or text-extracting the guarded logic so the reviewer's own mutations survived the suite; (4) non-binding escalation signals — the heuristic-tower anchor (§11.4.250) invoked ~30 times and the stall anchor's (§11.4.267) undeclared</w:t>
+      </w:r>
+      <w:r>
+        <w:t xml:space="preserve"> </w:t>
+      </w:r>
+      <w:r>
+        <w:rPr>
+          <w:rStyle w:val="VerbatimChar"/>
+        </w:rPr>
+        <w:t xml:space="preserve">N</w:t>
+      </w:r>
+      <w:r>
+        <w:t xml:space="preserve"> </w:t>
+      </w:r>
+      <w:r>
+        <w:t xml:space="preserve">never stopped a loop; (5) scope drift — an out-of-scope tangent absorbed into a review's round counter. (A) declared round budget (a round = one independent review verdict; splitting/renaming does not reset the count except per (E)(3); a spun-out tracked item inherits the parent's consumed count except for an (E)(2)-boundary finding, recurrence-linked per §11.4.214). (B) ground-truth probe (authoritative source + real-composition-path fixture + recorded behavioural model) required BEFORE the first fix whenever correctness depends on an unowned external system; a gate verified on a simplified model is wrong-layer evidence (§11.4.226) and cannot GO. (C) class-exhaustive enumeration on first instance — name the class, enumerate every member with a control-needled instrument (§11.4.201(7)(b)), close or explicitly scope-out every member; fixing only the reported instance when the class is nameable is itself a violation; building a missing classifier IS the remediation. (D) every remediation-round regression test drives the REAL artifact through its real invocation path (§11.4.224(A)) — a test that re-implements or text-extracts the guarded logic is a</w:t>
+      </w:r>
+      <w:r>
+        <w:t xml:space="preserve"> </w:t>
+      </w:r>
+      <w:r>
+        <w:rPr>
+          <w:rStyle w:val="VerbatimChar"/>
+        </w:rPr>
+        <w:t xml:space="preserve">source-defect</w:t>
+      </w:r>
+      <w:r>
+        <w:t xml:space="preserve"> </w:t>
+      </w:r>
+      <w:r>
+        <w:t xml:space="preserve">(§11.4.235(D)); every reviewer-surviving mutation is adopted verbatim and must fail the suite before the next review; the dispatch seam refuses to START a review missing that record, but a review that WAS dispatched and returned a verdict always counts. (E) at round 3+ the fixer records a convergence assessment; two-or-more findings sharing a (C)-named class (with ≥1 non-MINOR) / a reappearing finding / wrong-layer evidence forces a STRUCTURAL round (fresh fixer instance, re-derive (B), re-run (C) over the whole scope, replace rather than layer) unless an operator decision (§11.4.66) defers it; every review declares its scope/threat boundary before round 1, fixed except by recorded operator decision — narrowing it mid-loop to reach GO is a §11.4.6 fabrication; at</w:t>
+      </w:r>
+      <w:r>
+        <w:t xml:space="preserve"> </w:t>
+      </w:r>
+      <w:r>
+        <w:rPr>
+          <w:rStyle w:val="VerbatimChar"/>
+        </w:rPr>
+        <w:t xml:space="preserve">R_max</w:t>
+      </w:r>
+      <w:r>
+        <w:t xml:space="preserve"> </w:t>
+      </w:r>
+      <w:r>
+        <w:t xml:space="preserve">without GO the item STOPS (never runs</w:t>
+      </w:r>
+      <w:r>
+        <w:t xml:space="preserve"> </w:t>
+      </w:r>
+      <w:r>
+        <w:rPr>
+          <w:rStyle w:val="VerbatimChar"/>
+        </w:rPr>
+        <w:t xml:space="preserve">R_max</w:t>
+      </w:r>
+      <w:r>
+        <w:t xml:space="preserve">+1 under the same approach) and escalates to a recorded operator decision (re-scope via §11.4.148 / replace via a structural new item / §11.4.271 waiver for residual LOW only) — parked per §11.4.101/§11.4.267(F), parking only that work unit while the autonomous loop (§11.4.126) continues everything else, surfaced in every §11.4.97 report until resolved. (F) nothing here lowers §11.4.134's zero-finding/zero-warning GO bar, §11.4.209's substrate, §11.4.235(D)'s finding-layer classification, or §11.4.262's machine-evidence requirement — the budget bounds rounds, not rigor; reaching</w:t>
+      </w:r>
+      <w:r>
+        <w:t xml:space="preserve"> </w:t>
+      </w:r>
+      <w:r>
+        <w:rPr>
+          <w:rStyle w:val="VerbatimChar"/>
+        </w:rPr>
+        <w:t xml:space="preserve">R_max</w:t>
+      </w:r>
+      <w:r>
+        <w:t xml:space="preserve"> </w:t>
+      </w:r>
+      <w:r>
+        <w:t xml:space="preserve">without GO never yields a GO or a silent close. EXTENDS (not restates, §11.4.227) §11.4.134 (re-run obligation now bounded per-approach by this anchor, escalating per (E)(3) at the ceiling) and §11.4.267(E) (a one-sentence carve-out: an operator-mandated ceiling recorded with its own verbatim mandate in its own anchor is the one permitted</w:t>
+      </w:r>
+      <w:r>
+        <w:t xml:space="preserve"> </w:t>
+      </w:r>
+      <w:r>
+        <w:rPr>
+          <w:rStyle w:val="VerbatimChar"/>
+        </w:rPr>
+        <w:t xml:space="preserve">N</w:t>
+      </w:r>
+      <w:r>
+        <w:t xml:space="preserve">-bound literal). Honest boundary (§11.4.6): does not promise every item converges within</w:t>
+      </w:r>
+      <w:r>
+        <w:t xml:space="preserve"> </w:t>
+      </w:r>
+      <w:r>
+        <w:rPr>
+          <w:rStyle w:val="VerbatimChar"/>
+        </w:rPr>
+        <w:t xml:space="preserve">R_max</w:t>
+      </w:r>
+      <w:r>
+        <w:t xml:space="preserve"> </w:t>
+      </w:r>
+      <w:r>
+        <w:t xml:space="preserve">— a genuinely hard problem still produces real findings each round; what it removes is round inflation from re-discovering a wrong model, one member of a known class, a never-real test, an unacted stall signal, or scope drift; (E)(3) converts an open-ended loop into a bounded, evidence-backed operator decision, never a shallower review. Classification: universal (§11.4.17). Propagation gate</w:t>
+      </w:r>
+      <w:r>
+        <w:t xml:space="preserve"> </w:t>
+      </w:r>
+      <w:r>
+        <w:rPr>
+          <w:rStyle w:val="VerbatimChar"/>
+        </w:rPr>
+        <w:t xml:space="preserve">CM-COVENANT-114-276-PROPAGATION</w:t>
+      </w:r>
+      <w:r>
+        <w:t xml:space="preserve"> </w:t>
+      </w:r>
+      <w:r>
+        <w:t xml:space="preserve">(literal</w:t>
+      </w:r>
+      <w:r>
+        <w:t xml:space="preserve"> </w:t>
+      </w:r>
+      <w:r>
+        <w:rPr>
+          <w:rStyle w:val="VerbatimChar"/>
+        </w:rPr>
+        <w:t xml:space="preserve">11.4.276</w:t>
+      </w:r>
+      <w:r>
+        <w:t xml:space="preserve">, implemented in this change) + recommended gates</w:t>
+      </w:r>
+      <w:r>
+        <w:t xml:space="preserve"> </w:t>
+      </w:r>
+      <w:r>
+        <w:rPr>
+          <w:rStyle w:val="VerbatimChar"/>
+        </w:rPr>
+        <w:t xml:space="preserve">CM-REVIEW-ROUND-BUDGET</w:t>
+      </w:r>
+      <w:r>
+        <w:t xml:space="preserve"> </w:t>
+      </w:r>
+      <w:r>
+        <w:t xml:space="preserve">/</w:t>
+      </w:r>
+      <w:r>
+        <w:t xml:space="preserve"> </w:t>
+      </w:r>
+      <w:r>
+        <w:rPr>
+          <w:rStyle w:val="VerbatimChar"/>
+        </w:rPr>
+        <w:t xml:space="preserve">CM-REVIEW-ROUND3-CONVERGENCE-ASSESSMENT</w:t>
+      </w:r>
+      <w:r>
+        <w:t xml:space="preserve"> </w:t>
+      </w:r>
+      <w:r>
+        <w:t xml:space="preserve">/</w:t>
+      </w:r>
+      <w:r>
+        <w:t xml:space="preserve"> </w:t>
+      </w:r>
+      <w:r>
+        <w:rPr>
+          <w:rStyle w:val="VerbatimChar"/>
+        </w:rPr>
+        <w:t xml:space="preserve">CM-FIX-GROUND-TRUTH-AND-CLASS-INVENTORY</w:t>
+      </w:r>
+      <w:r>
+        <w:t xml:space="preserve"> </w:t>
+      </w:r>
+      <w:r>
+        <w:t xml:space="preserve">(registered as tracked deferrals OWED-GATE-111..113) + paired §1.1 mutations (round 8 with no operator decision / missing round-3 classification / a point-fix after a same-class trigger / a class closed with no inventory → each gate MUST FAIL; golden-FALSE: GO at round 4 with a clean round-3 assessment fires none). Gate CODE for the three recommended gates = separate work item, NOT claimed shipped (§11.4.6 / §11.4.227).</w:t>
+      </w:r>
+      <w:r>
+        <w:t xml:space="preserve"> </w:t>
+      </w:r>
+      <w:r>
+        <w:rPr>
+          <w:b/>
+          <w:bCs/>
+        </w:rPr>
+        <w:t xml:space="preserve">Canonical authority:</w:t>
+      </w:r>
+      <w:r>
+        <w:t xml:space="preserve"> </w:t>
+      </w:r>
+      <w:r>
+        <w:t xml:space="preserve">constitution submodule</w:t>
+      </w:r>
+      <w:r>
+        <w:t xml:space="preserve"> </w:t>
+      </w:r>
+      <w:hyperlink r:id="rId69">
+        <w:r>
+          <w:rPr>
+            <w:rStyle w:val="VerbatimChar"/>
+          </w:rPr>
+          <w:t xml:space="preserve">Constitution.md</w:t>
+        </w:r>
+      </w:hyperlink>
+      <w:r>
+        <w:t xml:space="preserve"> </w:t>
+      </w:r>
+      <w:r>
+        <w:t xml:space="preserve">§11.4.276. Non-compliance is a release blocker. No escape hatch — no</w:t>
+      </w:r>
+      <w:r>
+        <w:t xml:space="preserve"> </w:t>
+      </w:r>
+      <w:r>
+        <w:rPr>
+          <w:rStyle w:val="VerbatimChar"/>
+        </w:rPr>
+        <w:t xml:space="preserve">--unbounded-review-rounds</w:t>
+      </w:r>
+      <w:r>
+        <w:t xml:space="preserve">,</w:t>
+      </w:r>
+      <w:r>
+        <w:t xml:space="preserve"> </w:t>
+      </w:r>
+      <w:r>
+        <w:rPr>
+          <w:rStyle w:val="VerbatimChar"/>
+        </w:rPr>
+        <w:t xml:space="preserve">--fix-instance-not-class</w:t>
+      </w:r>
+      <w:r>
+        <w:t xml:space="preserve">,</w:t>
+      </w:r>
+      <w:r>
+        <w:t xml:space="preserve"> </w:t>
+      </w:r>
+      <w:r>
+        <w:rPr>
+          <w:rStyle w:val="VerbatimChar"/>
+        </w:rPr>
+        <w:t xml:space="preserve">--defer-ground-truth-probe</w:t>
+      </w:r>
+      <w:r>
+        <w:t xml:space="preserve">,</w:t>
+      </w:r>
+      <w:r>
+        <w:t xml:space="preserve"> </w:t>
+      </w:r>
+      <w:r>
+        <w:rPr>
+          <w:rStyle w:val="VerbatimChar"/>
+        </w:rPr>
+        <w:t xml:space="preserve">--narrow-threat-model-to-reach-go</w:t>
+      </w:r>
+      <w:r>
+        <w:t xml:space="preserve">,</w:t>
+      </w:r>
+      <w:r>
+        <w:t xml:space="preserve"> </w:t>
+      </w:r>
+      <w:r>
+        <w:rPr>
+          <w:rStyle w:val="VerbatimChar"/>
+        </w:rPr>
+        <w:t xml:space="preserve">--reset-round-count-on-refile</w:t>
+      </w:r>
+      <w:r>
+        <w:t xml:space="preserve">,</w:t>
+      </w:r>
+      <w:r>
+        <w:t xml:space="preserve"> </w:t>
+      </w:r>
+      <w:r>
+        <w:rPr>
+          <w:rStyle w:val="VerbatimChar"/>
+        </w:rPr>
+        <w:t xml:space="preserve">--defer-structural-fix-past-round-3</w:t>
       </w:r>
       <w:r>
         <w:t xml:space="preserve"> </w:t>
@@ -45513,8 +46791,8 @@
     </w:pPr>
     <w:rPr>
       <w:rFonts w:asciiTheme="majorHAnsi" w:cstheme="majorBidi" w:eastAsiaTheme="majorEastAsia" w:hAnsiTheme="majorHAnsi"/>
-      <w:sz w:val="40"/>
-      <w:szCs w:val="40"/>
+      <w:sz w:val="56"/>
+      <w:szCs w:val="56"/>
     </w:rPr>
   </w:style>
   <w:style w:customStyle="1" w:styleId="TitleChar" w:type="character">
@@ -45648,8 +46926,8 @@
     <w:rPr>
       <w:rFonts w:asciiTheme="majorHAnsi" w:cstheme="majorBidi" w:eastAsiaTheme="majorEastAsia" w:hAnsiTheme="majorHAnsi"/>
       <w:color w:themeColor="accent1" w:themeShade="BF" w:val="0F4761"/>
-      <w:sz w:val="32"/>
-      <w:szCs w:val="32"/>
+      <w:sz w:val="40"/>
+      <w:szCs w:val="40"/>
     </w:rPr>
   </w:style>
   <w:style w:styleId="Heading2" w:type="paragraph">
@@ -45671,8 +46949,8 @@
     <w:rPr>
       <w:rFonts w:asciiTheme="majorHAnsi" w:cstheme="majorBidi" w:eastAsiaTheme="majorEastAsia" w:hAnsiTheme="majorHAnsi"/>
       <w:color w:themeColor="accent1" w:themeShade="BF" w:val="0F4761"/>
-      <w:sz w:val="26"/>
-      <w:szCs w:val="26"/>
+      <w:sz w:val="32"/>
+      <w:szCs w:val="32"/>
     </w:rPr>
   </w:style>
   <w:style w:styleId="Heading3" w:type="paragraph">
@@ -45694,8 +46972,8 @@
     <w:rPr>
       <w:rFonts w:cstheme="majorBidi" w:eastAsiaTheme="majorEastAsia"/>
       <w:color w:themeColor="accent1" w:themeShade="BF" w:val="0F4761"/>
-      <w:sz w:val="24"/>
-      <w:szCs w:val="24"/>
+      <w:sz w:val="28"/>
+      <w:szCs w:val="28"/>
     </w:rPr>
   </w:style>
   <w:style w:styleId="Heading4" w:type="paragraph">
@@ -45715,8 +46993,6 @@
       <w:outlineLvl w:val="3"/>
     </w:pPr>
     <w:rPr>
-      <w:sz w:val="22"/>
-      <w:szCs w:val="22"/>
       <w:rFonts w:cstheme="majorBidi" w:eastAsiaTheme="majorEastAsia"/>
       <w:i/>
       <w:iCs/>

</xml_diff>

<commit_message>
HELD (local only, DO NOT PUSH): snapshot of all uncommitted constitution work, 2026-10-12
ATM-1181 Land-A preparation (§9 zero-loss). Preserves every dirty/untracked path
(excluding .fc_worktrees/ scratch worktrees) on top of the 3 held local commits
b61583e / 60dddf8 / 511559a, so the checkout can move to the landing branch
without losing anything. Includes regenerated twins, fastcycle edits, the
index-freshness seam, the staged kedge removal and the §11.4.235(E) amendment
working copy. Unreviewed in parts; not for publication.

Co-Authored-By: Claude Opus 5.5 <noreply@anthropic.com>
</commit_message>
<xml_diff>
--- a/AGENTS.docx
+++ b/AGENTS.docx
@@ -67,7 +67,7 @@
               <w:pStyle w:val="Compact"/>
             </w:pPr>
             <w:r>
-              <w:t xml:space="preserve">73</w:t>
+              <w:t xml:space="preserve">74</w:t>
             </w:r>
           </w:p>
         </w:tc>
@@ -115,7 +115,7 @@
               <w:pStyle w:val="Compact"/>
             </w:pPr>
             <w:r>
-              <w:t xml:space="preserve">2026-10-05T07:49:21Z</w:t>
+              <w:t xml:space="preserve">2026-10-09T13:48:57Z</w:t>
             </w:r>
           </w:p>
         </w:tc>
@@ -163,7 +163,178 @@
               <w:pStyle w:val="Compact"/>
             </w:pPr>
             <w:r>
-              <w:t xml:space="preserve">Amendment of 2026-10-05 — NEW §11.4.276 (review-round budget, 5-7 max, operator CRITICAL mandate) landed, with reconciling extensions to §11.4.134 and §11.4.267(E); full detail in the canonical Constitution.md header (same date). Prior round: Amendment of 2026-10-04 (round 2, fix-forward on the independent Opus-xhigh review of 5fd59fa: NO-GO, 0 Blocking / 2 Important / 6 Minor) — §11.4.230(D) corrected in place: (D.3) §11.4.236 mandated validation is now AT MINIMUM source-GO + §11.4.235(A) pre/post-build gates PLUS every operator-declared QA-deploy-seam blocker (§11.4.236) and any touched §11.4.239 critical-invariant scenarios; (D.1)/(D.3)/(D.4) re-keyed from "trunk" to the increment's own INTEGRATION BRANCH, a QA build MAY be cut from a feat/product/flavor branch and for feat/ IS the §11.4.195(B) live-manual-QA vehicle (removes the trunk↔§11.4.195(B) circularity; product/flavor lines now covered); (D.3) builds coalesce (in-flight build covers prior increments) and a periodic interval must carry a recorded justification; (D.2) toggle-expiry extensions only via a §11.4.271 waiver; heading + preamble now name clause (D); next-clause-letter (E) note added; CM-QA-BUILD-CADENCE-DECLARED + CM-INCREMENT-DELIVERED-NOT-SPEC-WITHHELD contracts amended for coalescing (the latter not flagged by the review, aligned for the same false-positive reason); ledger rows OWED-GATE-107..110 formatting aligned. Constitution-submodule .html/.pdf/.docx twins NOT regenerated this round either (honestly stale per §11.4.106(E)); main-repo mirror twins regenerated in the paired main-repo commit. Prior round: Amendment of 2026-10-04 — §11.4.230 EXTENDED in place with clause (D) INCREMENTAL DELIVERY GRANULARITY + DECLARED QA-BUILD CADENCE (operator mandate 2026-10-04,</w:t>
+              <w:t xml:space="preserve">Amendment of 2026-10-09, fix round 4 — STRUCTURAL round under §11.4.276(E)(1) (closing the round-3 independent review, NO-GO 0 blocking / 5 important / 10 minor). CONVERGENCE ASSESSMENT (§11.4.276(E)): round 4 of R_max; recurrence class = the per-device SKIP/lease vocabulary of (E.2), touched in two consecutive rounds (round 2: an invented reason code; round 3: a lease mapped onto</w:t>
+            </w:r>
+            <w:r>
+              <w:t xml:space="preserve"> </w:t>
+            </w:r>
+            <w:r>
+              <w:rPr>
+                <w:rStyle w:val="VerbatimChar"/>
+              </w:rPr>
+              <w:t xml:space="preserve">hardware_not_present</w:t>
+            </w:r>
+            <w:r>
+              <w:t xml:space="preserve">/</w:t>
+            </w:r>
+            <w:r>
+              <w:rPr>
+                <w:rStyle w:val="VerbatimChar"/>
+              </w:rPr>
+              <w:t xml:space="preserve">instrument_unavailable</w:t>
+            </w:r>
+            <w:r>
+              <w:t xml:space="preserve"> </w:t>
+            </w:r>
+            <w:r>
+              <w:t xml:space="preserve">with a non-existent</w:t>
+            </w:r>
+            <w:r>
+              <w:t xml:space="preserve"> </w:t>
+            </w:r>
+            <w:r>
+              <w:rPr>
+                <w:rStyle w:val="VerbatimChar"/>
+              </w:rPr>
+              <w:t xml:space="preserve">detail</w:t>
+            </w:r>
+            <w:r>
+              <w:t xml:space="preserve"> </w:t>
+            </w:r>
+            <w:r>
+              <w:t xml:space="preserve">sub-field, which asserts a PRESENT board absent); structural replacement = the lease case is REMOVED from the §11.4.69 SKIP vocabulary entirely and recorded in the deploy record as</w:t>
+            </w:r>
+            <w:r>
+              <w:t xml:space="preserve"> </w:t>
+            </w:r>
+            <w:r>
+              <w:rPr>
+                <w:rStyle w:val="VerbatimChar"/>
+              </w:rPr>
+              <w:t xml:space="preserve">DEFERRED</w:t>
+            </w:r>
+            <w:r>
+              <w:t xml:space="preserve"> </w:t>
+            </w:r>
+            <w:r>
+              <w:t xml:space="preserve">(field</w:t>
+            </w:r>
+            <w:r>
+              <w:t xml:space="preserve"> </w:t>
+            </w:r>
+            <w:r>
+              <w:rPr>
+                <w:rStyle w:val="VerbatimChar"/>
+              </w:rPr>
+              <w:t xml:space="preserve">device_leased_by_other_stream</w:t>
+            </w:r>
+            <w:r>
+              <w:t xml:space="preserve"> </w:t>
+            </w:r>
+            <w:r>
+              <w:t xml:space="preserve">naming the holder), a §11.4.69 SKIP now covering only genuinely absent (</w:t>
+            </w:r>
+            <w:r>
+              <w:rPr>
+                <w:rStyle w:val="VerbatimChar"/>
+              </w:rPr>
+              <w:t xml:space="preserve">hardware_not_present</w:t>
+            </w:r>
+            <w:r>
+              <w:t xml:space="preserve">) or ineligible (</w:t>
+            </w:r>
+            <w:r>
+              <w:rPr>
+                <w:rStyle w:val="VerbatimChar"/>
+              </w:rPr>
+              <w:t xml:space="preserve">topology_unsupported</w:t>
+            </w:r>
+            <w:r>
+              <w:t xml:space="preserve">) devices, the cause carried alongside the code (deploy-record field, or the SKIP description where the helper has no field — the §11.4.69 helper takes a description and a code only); the same round REPLACED the gate's ad-hoc config/ledger greps with one strict parser and the 'last dotted group' carry check with one POSITIONAL-DIGIT ID GRAMMAR shared with the version tool. Text changes, block byte-identical across all 10 carriers (the 9 governance files plus the generated groups/project-lifecycle-and-release.md — round 3's 'all 9 carriers' undercounted): (E.2) DEFERRED replaces the lease SKIP, N counts consecutive DEFERRED builds; (E.3) a FAIL links to the item and re-opens it only if it is terminal (an open item is linked, never 're-opened', §11.4.214); (E.4) zero-target wording follows (E.2); (E.5) a consumer bound by (E.4) MUST bind a deploy ledger, so its no-ledger SKIP is a CONFIG ERROR at the release seam — the SKIP stays legitimate only for a consumer not bound by (E.4); UNDECLARED is a result a consuming release seam MUST treat as blocking (§11.4.135), honestly stated as an obligation on a seam that does not exist yet (tracked per consuming project), no longer 'blocks exactly as a FAIL does'; the carry exemption needs an explicit declaration BACKED BY a recorded operator decision (§11.4.66); NEW grammar (i) every dotted group positional (a dotted suffix or build-metadata group can no longer hide</w:t>
+            </w:r>
+            <w:r>
+              <w:t xml:space="preserve"> </w:t>
+            </w:r>
+            <w:r>
+              <w:rPr>
+                <w:rStyle w:val="VerbatimChar"/>
+              </w:rPr>
+              <w:t xml:space="preserve">0.0.10</w:t>
+            </w:r>
+            <w:r>
+              <w:t xml:space="preserve">), (ii) no dash-joined numeric runs, (iii) owned group leading-zero-free. scripts/gates/cm_version_increment_on_deploy.sh: strict config parser (unknown / duplicated / empty key, non key=value line ⇒ exit 2; a named but missing, non-regular or unreadable config ⇒ exit 2, no longer SKIP), strict ledger rows (exactly 2 non-empty TAB fields ⇒ else exit 2), required</w:t>
+            </w:r>
+            <w:r>
+              <w:t xml:space="preserve"> </w:t>
+            </w:r>
+            <w:r>
+              <w:rPr>
+                <w:rStyle w:val="VerbatimChar"/>
+              </w:rPr>
+              <w:t xml:space="preserve">scheme_decision_ref</w:t>
+            </w:r>
+            <w:r>
+              <w:t xml:space="preserve"> </w:t>
+            </w:r>
+            <w:r>
+              <w:t xml:space="preserve">for semver/calver/other (else UNDECLARED), marker presence checked whatever the scheme, marker with no row after it ⇒ CARRY SKIP,</w:t>
+            </w:r>
+            <w:r>
+              <w:t xml:space="preserve"> </w:t>
+            </w:r>
+            <w:r>
+              <w:rPr>
+                <w:rStyle w:val="VerbatimChar"/>
+              </w:rPr>
+              <w:t xml:space="preserve">--help</w:t>
+            </w:r>
+            <w:r>
+              <w:t xml:space="preserve"> </w:t>
+            </w:r>
+            <w:r>
+              <w:t xml:space="preserve">prints only the header, informational modes refused unless alone and never print a VERDICT line; exit codes unchanged (0/1/2/3/4, still AWAITING OPERATOR CONFIRMATION); its meta-test grows from 28 to 68 fixtures; 26 reviewer-style mutants, 25 killed, 1 recorded equivalent (LC_ALL drop under gawk rational ranges). STALE generated twins (§11.4.106(E), not regenerated): the ROOT twins Constitution/CLAUDE/AGENTS/QWEN/GEMINI .html/.pdf/.docx (dated 2026-10-05) and the group twins groups/project-lifecycle-and-release.{html,pdf,docx} (dated 2026-10-08). Prior round (same amendment): Amendment of 2026-10-09, fix round 3 (closing both round-2 independent reviews: constitution side NO-GO 0/4/8, main side NO-GO 0/2/many) — §11.4.235(E) amended in place, block byte-identical across all 9 carriers: (E.2) per-device SKIP codes now map onto the EXISTING §11.4.69 closed set (no device ⇒ hardware_not_present; ineligible ⇒ topology_unsupported; leased by another stream ⇒ instrument_unavailable where the consumer's set carries it, else hardware_not_present), the specific cause carried in a detail sub-field — the closed set is NOT extended; a lease-held device's retry is bounded (after N consecutive lease SKIPs, N consumer DATA, the stall escalates per §11.4.267(D)); devices count as independent only when their control transports are (a shared host transport daemon whose recovery restarts it forces its legs to serialise unless per-device isolation is proven); (E.4) binding now keyed on having an official flash/deploy entry point, or a bound deploy ledger, for a device-targeted artifact, an undeclared device-listing command on a bound consumer being a blocking CONFIG ERROR (supersedes the round-2 wording 'binds only a consumer that declares a device-listing command'), and the self-referential '(E.2)–(E.4) bind only…' wording fixed; (E.5) once a deploy ledger is bound, version_scheme is REQUIRED — undeclared is a distinct blocking UNDECLARED result, the SemVer/CalVer/other exemption exists only by explicit declaration; scripts/gates/cm_version_increment_on_deploy.sh now gives every verdict its own exit code (0 PASS, 1 FAIL, 2 config error, 3 UNDECLARED, 4 SKIP — this exit-code scheme is a proposal AWAITING OPERATOR CONFIRMATION) and prints machine-readable VERDICT:/CARRY: lines, rejects duplicated config keys, and checks the LAST dotted group so a suffix cannot hide a no-carry id; its paired mutation test asserts exact exit codes and verdict lines on every fixture and gains fixtures killing reviewer mutants M1 M2 M3 M4 M6 M7 M8 M9 (M5 recorded as near-equivalent). STALE generated twins (§11.4.106(E), not regenerated this round): the ROOT twins Constitution/CLAUDE/AGENTS/QWEN/GEMINI .html/.pdf/.docx (dated 2026-10-05) AND the group twins groups/project-lifecycle-and-release.{html,pdf,docx} (dated 2026-10-08) all predate this amendment. Prior round (same amendment): Amendment of 2026-10-09 — §11.4.235 EXTENDED in place with clause (E) (operator mandate 2026-10-09,</w:t>
+            </w:r>
+            <w:r>
+              <w:t xml:space="preserve"> </w:t>
+            </w:r>
+            <w:r>
+              <w:rPr>
+                <w:rStyle w:val="VerbatimChar"/>
+              </w:rPr>
+              <w:t xml:space="preserve">IMPORTANT</w:t>
+            </w:r>
+            <w:r>
+              <w:t xml:space="preserve">): a completed group/increment holding its source-correctness GO ⇒ background flashable build ⇒ flash to EVERY target enumerated fresh by the consumer-declared device-listing command (each §11.4.200 target-isolated + read-back-verified; independent devices concurrent, shared exclusive resources serialised per §11.4.119) ⇒ LIVE verification on each device of a basic major-sanity suite AND every workable item in the build with captured machine evidence (§11.4.262); zero devices ⇒ honest SKIP + tracked item; every deployed image gets a DECIMAL-CARRY version increment (non-leftmost positions 0..9, carry left, leftmost absorbs: 1.0.0-dev-0.0.9 → 1.0.0-dev-0.1.0) via the consumer's single version tool. Extension, not a new anchor (§11.4.227 audit: no carry rule, no flash-all-targets obligation, no per-item live binding existed).</w:t>
+            </w:r>
+            <w:r>
+              <w:t xml:space="preserve"> </w:t>
+            </w:r>
+            <w:r>
+              <w:rPr>
+                <w:rStyle w:val="VerbatimChar"/>
+              </w:rPr>
+              <w:t xml:space="preserve">CM-VERSION-DECIMAL-CARRY</w:t>
+            </w:r>
+            <w:r>
+              <w:t xml:space="preserve"> </w:t>
+            </w:r>
+            <w:r>
+              <w:t xml:space="preserve">IMPLEMENTED inside cm_version_increment_on_deploy.sh (RED→GREEN, paired mutation discriminators);</w:t>
+            </w:r>
+            <w:r>
+              <w:t xml:space="preserve"> </w:t>
+            </w:r>
+            <w:r>
+              <w:rPr>
+                <w:rStyle w:val="VerbatimChar"/>
+              </w:rPr>
+              <w:t xml:space="preserve">CM-GROUP-DEPLOY-FLASH-ALL-AND-LIVE-VERIFIED</w:t>
+            </w:r>
+            <w:r>
+              <w:t xml:space="preserve"> </w:t>
+            </w:r>
+            <w:r>
+              <w:t xml:space="preserve">registered as tracked deferral OWED-GATE-114. Fix round (2026-10-09, independent Opus review NO-GO 0/4/10/2): (E.2) 'available' now = enumerated AND eligible for the image's product/hardware (consumer DATA) AND device lease acquired (§11.4.176/§11.4.119), ineligible or leased boards a per-device SKIP-with-reason; (E.4) latent binding (binds only a consumer that declares a device-listing command); (E.1) reconciled with the §11.4.230(D.3) cadence + coalescing; (E.5) carry FENCED to the consumer-declared positional-digit version scheme and, at the gate, to ledger rows after a declared adoption marker (§11.4.224(E) precedent) — this fencing is a CONSERVATIVE-SAFE INTERPRETATION of the operator's 'universally applied' wording, AWAITING OPERATOR CONFIRMATION; rollover-vs-§11.4.151 and integer-code monotonicity reconciled; heading names (E); honest boundary covers (A)–(E); next free clause letter (F). Generated twins groups/project-lifecycle-and-release.{html,pdf,docx} are STALE versus the regenerated .md (§11.4.106(E)) — not regenerated in this round. Prior round: Amendment of 2026-10-05 — NEW §11.4.276 (review-round budget, 5-7 max, operator CRITICAL mandate) landed, with reconciling extensions to §11.4.134 and §11.4.267(E); full detail in the canonical Constitution.md header (same date). Prior round: Amendment of 2026-10-04 (round 2, fix-forward on the independent Opus-xhigh review of 5fd59fa: NO-GO, 0 Blocking / 2 Important / 6 Minor) — §11.4.230(D) corrected in place: (D.3) §11.4.236 mandated validation is now AT MINIMUM source-GO + §11.4.235(A) pre/post-build gates PLUS every operator-declared QA-deploy-seam blocker (§11.4.236) and any touched §11.4.239 critical-invariant scenarios; (D.1)/(D.3)/(D.4) re-keyed from "trunk" to the increment's own INTEGRATION BRANCH, a QA build MAY be cut from a feat/product/flavor branch and for feat/ IS the §11.4.195(B) live-manual-QA vehicle (removes the trunk↔§11.4.195(B) circularity; product/flavor lines now covered); (D.3) builds coalesce (in-flight build covers prior increments) and a periodic interval must carry a recorded justification; (D.2) toggle-expiry extensions only via a §11.4.271 waiver; heading + preamble now name clause (D); next-clause-letter (E) note added; CM-QA-BUILD-CADENCE-DECLARED + CM-INCREMENT-DELIVERED-NOT-SPEC-WITHHELD contracts amended for coalescing (the latter not flagged by the review, aligned for the same false-positive reason); ledger rows OWED-GATE-107..110 formatting aligned. Constitution-submodule .html/.pdf/.docx twins NOT regenerated this round either (honestly stale per §11.4.106(E)); main-repo mirror twins regenerated in the paired main-repo commit. Prior round: Amendment of 2026-10-04 — §11.4.230 EXTENDED in place with clause (D) INCREMENTAL DELIVERY GRANULARITY + DECLARED QA-BUILD CADENCE (operator mandate 2026-10-04,</w:t>
             </w:r>
             <w:r>
               <w:t xml:space="preserve"> </w:t>
@@ -31943,7 +32114,7 @@
           <w:b/>
           <w:bCs/>
         </w:rPr>
-        <w:t xml:space="preserve">§11.4.235 — Build-and-deploy the moment source fixes are proven-correct (test-side hardening is a parallel stage, never a build gate) + post-deploy version increment (operator mandate, 2026-07-27).</w:t>
+        <w:t xml:space="preserve">§11.4.235 — Build-and-deploy the moment source fixes are proven-correct (test-side hardening is a parallel stage, never a build gate) + post-deploy version increment + per-group flash-every-eligible-target live verification with a decimal-carry version increment (operator mandate, 2026-07-27; clause (E) added 2026-10-09).</w:t>
       </w:r>
     </w:p>
     <w:p>
@@ -32228,13 +32399,536 @@
           <w:b/>
           <w:bCs/>
         </w:rPr>
-        <w:t xml:space="preserve">Honest boundary (§11.4.6):</w:t>
-      </w:r>
-      <w:r>
-        <w:t xml:space="preserve"> </w:t>
-      </w:r>
-      <w:r>
-        <w:t xml:space="preserve">relocates the TEST-INSTRUMENTATION re-review + gate/check hardening OFF the build critical path; does NOT weaken any substantive gate. The SOURCE-correctness review (§11.4.125/§11.4.142/§11.4.194 Opus-</w:t>
+        <w:t xml:space="preserve">(E) GROUP-COMPLETE ⇒ BACKGROUND FLASHABLE BUILD ⇒ FLASH EVERY AVAILABLE TARGET ⇒ LIVE VERIFICATION OF SANITY + EVERY CONTAINED ITEM, WITH A DECIMAL-CARRY VERSION INCREMENT ON EVERY DEPLOYED IMAGE (operator mandate, 2026-10-09,</w:t>
+      </w:r>
+      <w:r>
+        <w:rPr>
+          <w:b/>
+          <w:bCs/>
+        </w:rPr>
+        <w:t xml:space="preserve"> </w:t>
+      </w:r>
+      <w:r>
+        <w:rPr>
+          <w:rStyle w:val="VerbatimChar"/>
+          <w:b/>
+          <w:bCs/>
+        </w:rPr>
+        <w:t xml:space="preserve">IMPORTANT</w:t>
+      </w:r>
+      <w:r>
+        <w:rPr>
+          <w:b/>
+          <w:bCs/>
+        </w:rPr>
+        <w:t xml:space="preserve">; added 2026-10-09).</w:t>
+      </w:r>
+      <w:r>
+        <w:t xml:space="preserve"> </w:t>
+      </w:r>
+      <w:r>
+        <w:t xml:space="preserve">Verbatim operator mandate (2026-10-09): "As group by group of tasks from issues_01 gets done, we MUST create flashing image in the background, flash it to all available Orange Pi connected devices (see the list using adb devices command), and perform LIVE testing on devices of basic system major sanity and all workable items coming in into that particular build! We MUST after each flashing image we build and deploy (using our flashing scripts) regularly increase version or version code! Remember that once we get to 9 at some position we switch it to 0 and first left one we incresae by one! Example: 1.0.0-dev-0.0.9 -&gt; 1.0.0-dev-0.1.0 !!! Make sure that all these mandatory RULES are universally applied acrtoss all projects and added into the constitution Submodule, commited and pushed to all upstreams!!!" (the project names and the device-listing command in that quote are the operator's own example, recorded verbatim; the rule below is generic and consumers supply those names as DATA per §11.4.35). The GAP this clause closes, stated precisely so it is not restated elsewhere (§11.4.227): clause (A) triggers the build on a source-correctness GO and clause (B) increments the version on every deploy; §11.4.230(B) exercises every available device concurrently during VALIDATION and §11.4.230(D.3) cuts a QA deliverable on a declared cadence; §11.4.200 target-isolates and read-back-verifies each single flash; §11.4.236 refuses a QA hand-off without a candidate-fingerprinted verdict — but none of them obliges a completed group's image to be FLASHED onto EVERY available target, none binds LIVE on-device verification of a basic major-sanity suite PLUS every workable item contained in that build, and none fixes HOW a version id is incremented (measured 2026-10-09 with a control-needled census over §11.4.235/.230/.236/.200/.119/.108/.151/.264: zero decimal-carry rule, zero "flash every available target" obligation, zero per-item live-verification binding; the only</w:t>
+      </w:r>
+      <w:r>
+        <w:t xml:space="preserve"> </w:t>
+      </w:r>
+      <w:r>
+        <w:rPr>
+          <w:rStyle w:val="VerbatimChar"/>
+        </w:rPr>
+        <w:t xml:space="preserve">carry</w:t>
+      </w:r>
+      <w:r>
+        <w:t xml:space="preserve"> </w:t>
+      </w:r>
+      <w:r>
+        <w:t xml:space="preserve">hits are the verb "carries"; positive control</w:t>
+      </w:r>
+      <w:r>
+        <w:t xml:space="preserve"> </w:t>
+      </w:r>
+      <w:r>
+        <w:rPr>
+          <w:rStyle w:val="VerbatimChar"/>
+        </w:rPr>
+        <w:t xml:space="preserve">version</w:t>
+      </w:r>
+      <w:r>
+        <w:t xml:space="preserve"> </w:t>
+      </w:r>
+      <w:r>
+        <w:t xml:space="preserve">= 18 hits in §11.4.235, negative control = 0). ALL of the following hold:</w:t>
+      </w:r>
+    </w:p>
+    <w:p>
+      <w:pPr>
+        <w:pStyle w:val="BodyText"/>
+      </w:pPr>
+      <w:r>
+        <w:rPr>
+          <w:b/>
+          <w:bCs/>
+        </w:rPr>
+        <w:t xml:space="preserve">(E.1) TRIGGER + BACKGROUND BUILD.</w:t>
+      </w:r>
+      <w:r>
+        <w:t xml:space="preserve"> </w:t>
+      </w:r>
+      <w:r>
+        <w:t xml:space="preserve">The moment a group / increment (§11.4.230(D.1) — a project-declared group of tracked items) holds its source-correctness GO per clauses (A)/(D), it is ELIGIBLE for a FLASHABLE image (the consumer's deployable artifact, §11.4.230(D.3)), and that image MUST be built in the BACKGROUND (§11.4.89 / §11.4.230(A) — the loop keeps progressing other items while it builds), through the consumer's official build entry point only, inside the §12 host-safety bounds (§12.6 / §12.11 / §12.12). WHEN the build is cut follows the consumer's declared §11.4.230(D.3) QA-build cadence and its coalescing rule — never a second, competing cadence: under the default</w:t>
+      </w:r>
+      <w:r>
+        <w:t xml:space="preserve"> </w:t>
+      </w:r>
+      <w:r>
+        <w:rPr>
+          <w:rStyle w:val="VerbatimChar"/>
+        </w:rPr>
+        <w:t xml:space="preserve">per-increment</w:t>
+      </w:r>
+      <w:r>
+        <w:t xml:space="preserve"> </w:t>
+      </w:r>
+      <w:r>
+        <w:t xml:space="preserve">trigger each GO'd group triggers a build; a build already in flight covers every group that reached GO before it started, a group reaching GO while it builds rolls into the NEXT build, and a build that fails covers nothing (its groups roll forward); a</w:t>
+      </w:r>
+      <w:r>
+        <w:t xml:space="preserve"> </w:t>
+      </w:r>
+      <w:r>
+        <w:rPr>
+          <w:rStyle w:val="VerbatimChar"/>
+        </w:rPr>
+        <w:t xml:space="preserve">periodic</w:t>
+      </w:r>
+      <w:r>
+        <w:t xml:space="preserve"> </w:t>
+      </w:r>
+      <w:r>
+        <w:t xml:space="preserve">/</w:t>
+      </w:r>
+      <w:r>
+        <w:t xml:space="preserve"> </w:t>
+      </w:r>
+      <w:r>
+        <w:rPr>
+          <w:rStyle w:val="VerbatimChar"/>
+        </w:rPr>
+        <w:t xml:space="preserve">whichever-first</w:t>
+      </w:r>
+      <w:r>
+        <w:t xml:space="preserve"> </w:t>
+      </w:r>
+      <w:r>
+        <w:t xml:space="preserve">consumer cuts at its declared trigger and every group that reached GO since the last covered build rides that build. A group without its GO is NOT built for flashing — clause (A) is unchanged.</w:t>
+      </w:r>
+    </w:p>
+    <w:p>
+      <w:pPr>
+        <w:pStyle w:val="BodyText"/>
+      </w:pPr>
+      <w:r>
+        <w:rPr>
+          <w:b/>
+          <w:bCs/>
+        </w:rPr>
+        <w:t xml:space="preserve">(E.2) FLASH EVERY AVAILABLE TARGET.</w:t>
+      </w:r>
+      <w:r>
+        <w:t xml:space="preserve"> </w:t>
+      </w:r>
+      <w:r>
+        <w:t xml:space="preserve">When the image exists it MUST be deployed, through the consumer's official flash/deploy tooling only, to EVERY AVAILABLE target device. A device is AVAILABLE for this image only when ALL THREE hold: (i) it is ENUMERATED fresh at flash time by the consumer-declared device-listing command (DATA per §11.4.35, e.g.</w:t>
+      </w:r>
+      <w:r>
+        <w:t xml:space="preserve"> </w:t>
+      </w:r>
+      <w:r>
+        <w:rPr>
+          <w:rStyle w:val="VerbatimChar"/>
+        </w:rPr>
+        <w:t xml:space="preserve">adb devices</w:t>
+      </w:r>
+      <w:r>
+        <w:t xml:space="preserve">), keyed by stable serial (§11.4.111), never a remembered or hand-typed list (§11.4.6); (ii) it is ELIGIBLE for this image — its product / hardware class matches the image's target per the consumer-declared eligibility map (DATA per §11.4.35; an image is never flashed onto a board of a different product line or hardware variant); and (iii) its device LEASE is acquired for this deploy under the §11.4.176(B) / §11.4.119 single-owner device lock (all-or-nothing, non-blocking, TTL-reaped — the consumer's lock mechanism). An enumerated device that cannot be exercised is recorded per device by one of TWO DIFFERENT mechanisms, never conflated, and in neither case is it reflashed out from under its owner or silently dropped. (1) An honest §11.4.69 SKIP-with-reason (§11.4.3) — used ONLY when the device is genuinely absent or ineligible; its reason code MUST be a member of the consumer's §11.4.69 CLOSED reason set (this clause mints NO new code and does NOT extend that set; a helper that enforces the set turns an out-of-set code into a FAIL, §11.4.69): no device enumerated ⇒</w:t>
+      </w:r>
+      <w:r>
+        <w:t xml:space="preserve"> </w:t>
+      </w:r>
+      <w:r>
+        <w:rPr>
+          <w:rStyle w:val="VerbatimChar"/>
+        </w:rPr>
+        <w:t xml:space="preserve">hardware_not_present</w:t>
+      </w:r>
+      <w:r>
+        <w:t xml:space="preserve">; enumerated but ineligible for this image ⇒</w:t>
+      </w:r>
+      <w:r>
+        <w:t xml:space="preserve"> </w:t>
+      </w:r>
+      <w:r>
+        <w:rPr>
+          <w:rStyle w:val="VerbatimChar"/>
+        </w:rPr>
+        <w:t xml:space="preserve">topology_unsupported</w:t>
+      </w:r>
+      <w:r>
+        <w:t xml:space="preserve">. (2) DEFERRED — a device whose lease is held by another stream is NOT a §11.4.69 SKIP at all, because it IS present and eligible: recording it as</w:t>
+      </w:r>
+      <w:r>
+        <w:t xml:space="preserve"> </w:t>
+      </w:r>
+      <w:r>
+        <w:rPr>
+          <w:rStyle w:val="VerbatimChar"/>
+        </w:rPr>
+        <w:t xml:space="preserve">hardware_not_present</w:t>
+      </w:r>
+      <w:r>
+        <w:t xml:space="preserve"> </w:t>
+      </w:r>
+      <w:r>
+        <w:t xml:space="preserve">would assert that a present board is absent, exactly the misstatement §11.4.69 / §11.4.6 forbid. It is recorded in the DEPLOY RECORD as</w:t>
+      </w:r>
+      <w:r>
+        <w:t xml:space="preserve"> </w:t>
+      </w:r>
+      <w:r>
+        <w:rPr>
+          <w:rStyle w:val="VerbatimChar"/>
+        </w:rPr>
+        <w:t xml:space="preserve">DEFERRED</w:t>
+      </w:r>
+      <w:r>
+        <w:t xml:space="preserve">, with the deploy-record field</w:t>
+      </w:r>
+      <w:r>
+        <w:t xml:space="preserve"> </w:t>
+      </w:r>
+      <w:r>
+        <w:rPr>
+          <w:rStyle w:val="VerbatimChar"/>
+        </w:rPr>
+        <w:t xml:space="preserve">device_leased_by_other_stream</w:t>
+      </w:r>
+      <w:r>
+        <w:t xml:space="preserve"> </w:t>
+      </w:r>
+      <w:r>
+        <w:t xml:space="preserve">naming the holder. The specific cause always travels ALONGSIDE the code — in a deploy-record field, or in the SKIP's description text where the consumer's SKIP helper has no field for it (the §11.4.69 helper takes a description and a reason code and nothing else; no</w:t>
+      </w:r>
+      <w:r>
+        <w:t xml:space="preserve"> </w:t>
+      </w:r>
+      <w:r>
+        <w:rPr>
+          <w:rStyle w:val="VerbatimChar"/>
+        </w:rPr>
+        <w:t xml:space="preserve">detail</w:t>
+      </w:r>
+      <w:r>
+        <w:t xml:space="preserve"> </w:t>
+      </w:r>
+      <w:r>
+        <w:t xml:space="preserve">sub-field exists). A DEFERRED device is retried at the next covered build, never waited on unboundedly, and the retry is BOUNDED: after N consecutive DEFERRED builds of the same device (N is consumer DATA per §11.4.35 / §11.4.267(E)), the stall escalates per §11.4.267(D) — a tracked §11.4.197 item naming the device and the holder, surfaced in every §11.4.97 report until resolved, and routed to a recorded operator decision (§11.4.66) — never an indefinite silent re-deferral. Each flash is target-isolated and verify-after-write per §11.4.200 (the deployed identity read back FROM each intended target). Independent devices are tested CONCURRENTLY; genuinely shared exclusive resources (one flash bus, one single-eligible-target flash tool, one power controller, one sink) serialise per §11.4.119 / §11.4.230(B). Devices count as independent only when their CONTROL TRANSPORTS are independent as well: legs that share one host-side transport daemon whose recovery path restarts that daemon (one debug-bridge server that a recovery step kills and restarts, for example) share an exclusive resource, so a flash or recovery leg on that daemon serialises with every live-test leg on the same daemon — unless each device is given its own daemon instance AND that per-device isolation has been proven to work on that host with captured evidence before anything relies on it (§11.4.6); an unproven isolation is treated as shared. An available device that cannot be flashed or verified is recorded per device as a FAIL or an honest SKIP-with-reason (§11.4.3), never silently dropped; the deploy record lists the enumerated, eligible, leased, flashed, and read-back-verified serials, plus every per-device SKIP reason code with its cause and every DEFERRED device with its holder.</w:t>
+      </w:r>
+    </w:p>
+    <w:p>
+      <w:pPr>
+        <w:pStyle w:val="BodyText"/>
+      </w:pPr>
+      <w:r>
+        <w:rPr>
+          <w:b/>
+          <w:bCs/>
+        </w:rPr>
+        <w:t xml:space="preserve">(E.3) LIVE VERIFICATION ON EACH FLASHED DEVICE.</w:t>
+      </w:r>
+      <w:r>
+        <w:t xml:space="preserve"> </w:t>
+      </w:r>
+      <w:r>
+        <w:t xml:space="preserve">On each verified device run (a) the consumer-declared basic major-sanity suite (at minimum: boot completed, core services up, no crash/hang loop — the suite named as DATA) AND (b) a LIVE test of EVERY workable item contained in that build — the item set recorded in the hand-off per §11.4.230(D.5) — each producing captured machine evidence on that device (§11.4.262 / §11.4.69 / §11.4.108 runtime layer); metadata-only, config-only, or grep-only PASS is forbidden (§11.4). An item whose live verification is genuinely device- or topology-gated is SKIP-with-reason PER ITEM (§11.4.3 / §11.4.69 reason code), never folded into a group-level PASS. A FAIL on any device is linked to the affected item; an item already in a terminal state is re-opened, while an item still open is only linked (§11.4.214 — 're-opening an open item' is undefined); a huge FAIL triggers §11.4.129.</w:t>
+      </w:r>
+    </w:p>
+    <w:p>
+      <w:pPr>
+        <w:pStyle w:val="BodyText"/>
+      </w:pPr>
+      <w:r>
+        <w:rPr>
+          <w:b/>
+          <w:bCs/>
+        </w:rPr>
+        <w:t xml:space="preserve">(E.4) LATENT BINDING + NO AVAILABLE DEVICE ⇒ HONEST SKIP.</w:t>
+      </w:r>
+      <w:r>
+        <w:t xml:space="preserve"> </w:t>
+      </w:r>
+      <w:r>
+        <w:t xml:space="preserve">The device legs — (E.2), (E.3), and the zero-device rule of this clause — bind every consumer that HAS an official flash/deploy entry point for a device-targeted artifact, or that has bound a deploy ledger for such an artifact to the §11.4.235 gates (the §11.4.96 / §11.4.275 latent-binding pattern); whether the consumer has declared its device-listing command does NOT decide the binding. A bound consumer MUST declare that command; a bound consumer that has not declared it is in a CONFIG ERROR — a blocking result, never N/A and never a reason to skip the device legs — because a project must not opt out of flashing its devices by leaving the command undeclared. Only a consumer with NO device-targeted flash/deploy entry point and NO deploy ledger bound for a device-targeted artifact (no flashable device tier at all) records the flash and live-verification legs as honest N/A (</w:t>
+      </w:r>
+      <w:r>
+        <w:rPr>
+          <w:rStyle w:val="VerbatimChar"/>
+        </w:rPr>
+        <w:t xml:space="preserve">feature_disabled_by_config</w:t>
+      </w:r>
+      <w:r>
+        <w:t xml:space="preserve">), never a fabricated device run, and the obligation binds the moment either condition becomes true. When a declared enumeration yields zero AVAILABLE targets (none enumerated, or every enumerated device ineligible or leased per (E.2)), the flash and live-verification legs record what (E.2) prescribes — a §11.4.69 SKIP-with-reason (</w:t>
+      </w:r>
+      <w:r>
+        <w:rPr>
+          <w:rStyle w:val="VerbatimChar"/>
+        </w:rPr>
+        <w:t xml:space="preserve">hardware_not_present</w:t>
+      </w:r>
+      <w:r>
+        <w:t xml:space="preserve">, cause</w:t>
+      </w:r>
+      <w:r>
+        <w:t xml:space="preserve"> </w:t>
+      </w:r>
+      <w:r>
+        <w:rPr>
+          <w:rStyle w:val="VerbatimChar"/>
+        </w:rPr>
+        <w:t xml:space="preserve">no_target_device_attached</w:t>
+      </w:r>
+      <w:r>
+        <w:t xml:space="preserve"> </w:t>
+      </w:r>
+      <w:r>
+        <w:t xml:space="preserve">carried as (E.2) describes, or</w:t>
+      </w:r>
+      <w:r>
+        <w:t xml:space="preserve"> </w:t>
+      </w:r>
+      <w:r>
+        <w:rPr>
+          <w:rStyle w:val="VerbatimChar"/>
+        </w:rPr>
+        <w:t xml:space="preserve">topology_unsupported</w:t>
+      </w:r>
+      <w:r>
+        <w:t xml:space="preserve"> </w:t>
+      </w:r>
+      <w:r>
+        <w:t xml:space="preserve">per ineligible device) and a DEFERRED record per leased device — plus a tracked §11.4.197 item for the owed live run — never a faked PASS and never a claim that the build was verified on hardware. The build itself still completes and is retained.</w:t>
+      </w:r>
+    </w:p>
+    <w:p>
+      <w:pPr>
+        <w:pStyle w:val="BodyText"/>
+      </w:pPr>
+      <w:r>
+        <w:rPr>
+          <w:b/>
+          <w:bCs/>
+        </w:rPr>
+        <w:t xml:space="preserve">(E.5) DECIMAL-CARRY VERSION INCREMENT ON EVERY DEPLOYED IMAGE.</w:t>
+      </w:r>
+      <w:r>
+        <w:t xml:space="preserve"> </w:t>
+      </w:r>
+      <w:r>
+        <w:t xml:space="preserve">Every image built and deployed under this clause carries a NEW version id per clause (B). SCOPE — universal in force, fenced in reach (a conservative-safe reading per §11.4.6 / §11.4.201(1), recorded as awaiting operator confirmation): the carry rule binds the dotted numeric group that the consumer's ONE version tool owns under its DECLARED version scheme (DATA per §11.4.35), and applies only where that declared scheme is POSITIONAL-DIGIT style (every non-leftmost position a single decimal digit, as in the operator's own example); a consumer on Semantic Versioning, Calendar Versioning, or any scheme whose positions are unbounded counters or dates declares that scheme and is NOT subject to the carry (</w:t>
+      </w:r>
+      <w:r>
+        <w:rPr>
+          <w:rStyle w:val="VerbatimChar"/>
+        </w:rPr>
+        <w:t xml:space="preserve">1.2.10</w:t>
+      </w:r>
+      <w:r>
+        <w:t xml:space="preserve"> </w:t>
+      </w:r>
+      <w:r>
+        <w:t xml:space="preserve">is correct SemVer) — that exemption exists ONLY by explicit declaration backed by a recorded operator decision (§11.4.66) naming the consumer — a declaration without that record is UNDECLARED (the gate requires the declaration to cite the record; whether the record exists and says so stays a review obligation the gate cannot verify, §11.4.6): once a consumer binds a deploy ledger, declaring its version scheme is MANDATORY, and a bound ledger with no declared scheme is UNDECLARED, a distinct result that a release seam consuming the gate MUST treat as blocking, exactly as a FAIL (§11.4.135) — until such a seam exists that is an obligation on the seam, tracked as a §11.4.197 item by each consuming project, not an enforced block — never a silent skip; a consumer that has bound no ledger at all records an honest SKIP whose result is mechanically distinct from a PASS (its own result code and machine-readable verdict, §11.4.1), BUT a consumer bound by (E.4) MUST bind a deploy ledger for its device-targeted artifact, so for such a consumer the no-ledger SKIP is a CONFIG ERROR at the release seam, never N/A — the SKIP stays legitimate ONLY for a consumer NOT bound by (E.4) — and enforcement over a deploy ledger applies only to rows AFTER the consumer-declared adoption marker (the §11.4.224(E) adoption-fence precedent) — ids minted before adoption are history and are never retroactively failed. Within that scope every version id obeys ONE POSITIONAL-DIGIT ID GRAMMAR, implemented identically by the consumer's version tool and by the gate: (i) in EVERY dotted numeric group of the id — any run of two or more dot-joined decimal positions, not only the owned one — every non-leftmost position is a single digit 0..9 and the leftmost has no leading zero (so a dotted suffix or build-metadata group can never hide a no-carry group:</w:t>
+      </w:r>
+      <w:r>
+        <w:t xml:space="preserve"> </w:t>
+      </w:r>
+      <w:r>
+        <w:rPr>
+          <w:rStyle w:val="VerbatimChar"/>
+        </w:rPr>
+        <w:t xml:space="preserve">…-0.0.10-rc.1.2</w:t>
+      </w:r>
+      <w:r>
+        <w:t xml:space="preserve"> </w:t>
+      </w:r>
+      <w:r>
+        <w:t xml:space="preserve">is in violation); (ii) no two numeric runs are joined by a single dash (</w:t>
+      </w:r>
+      <w:r>
+        <w:rPr>
+          <w:rStyle w:val="VerbatimChar"/>
+        </w:rPr>
+        <w:t xml:space="preserve">0.0-9</w:t>
+      </w:r>
+      <w:r>
+        <w:t xml:space="preserve">,</w:t>
+      </w:r>
+      <w:r>
+        <w:t xml:space="preserve"> </w:t>
+      </w:r>
+      <w:r>
+        <w:rPr>
+          <w:rStyle w:val="VerbatimChar"/>
+        </w:rPr>
+        <w:t xml:space="preserve">0.0.1-1</w:t>
+      </w:r>
+      <w:r>
+        <w:t xml:space="preserve">), because which group is owned would be ambiguous; (iii) the OWNED group — the dot-joined positions that END the id after its last dash, or the whole id when it has no dash — has no leading zero in any position (a single-position owned group such as</w:t>
+      </w:r>
+      <w:r>
+        <w:t xml:space="preserve"> </w:t>
+      </w:r>
+      <w:r>
+        <w:rPr>
+          <w:rStyle w:val="VerbatimChar"/>
+        </w:rPr>
+        <w:t xml:space="preserve">-dev-7</w:t>
+      </w:r>
+      <w:r>
+        <w:t xml:space="preserve"> </w:t>
+      </w:r>
+      <w:r>
+        <w:t xml:space="preserve">may grow). The tool refuses to bump any id that violates (i)–(iii) or does not end in its owned group; the gate fails any in-scope id that violates (i) or (ii) or whose owned group violates (iii) — an id ending in a non-numeric suffix (</w:t>
+      </w:r>
+      <w:r>
+        <w:rPr>
+          <w:rStyle w:val="VerbatimChar"/>
+        </w:rPr>
+        <w:t xml:space="preserve">-rc1</w:t>
+      </w:r>
+      <w:r>
+        <w:t xml:space="preserve">) has no owned group and is held to (i) and (ii) alone. The next id is computed by the DECIMAL CARRY rule: in that owned dotted numeric group (the trailing dot-joined decimal positions after any tag prefix and pre-release separator), every position except the leftmost holds a single digit 0..9; incrementing adds 1 to the LAST position; a position that would exceed 9 becomes 0 and carries +1 into the next-left position; the carry propagates as far as needed; the leftmost position absorbs the final carry and may grow; the tag prefix (§11.4.151), pre-release separators, and every non-group character are preserved verbatim. Worked examples:</w:t>
+      </w:r>
+      <w:r>
+        <w:t xml:space="preserve"> </w:t>
+      </w:r>
+      <w:r>
+        <w:rPr>
+          <w:rStyle w:val="VerbatimChar"/>
+        </w:rPr>
+        <w:t xml:space="preserve">1.0.0-dev-0.0.8 → 1.0.0-dev-0.0.9</w:t>
+      </w:r>
+      <w:r>
+        <w:t xml:space="preserve">;</w:t>
+      </w:r>
+      <w:r>
+        <w:t xml:space="preserve"> </w:t>
+      </w:r>
+      <w:r>
+        <w:rPr>
+          <w:rStyle w:val="VerbatimChar"/>
+        </w:rPr>
+        <w:t xml:space="preserve">1.0.0-dev-0.0.9 → 1.0.0-dev-0.1.0</w:t>
+      </w:r>
+      <w:r>
+        <w:t xml:space="preserve">;</w:t>
+      </w:r>
+      <w:r>
+        <w:t xml:space="preserve"> </w:t>
+      </w:r>
+      <w:r>
+        <w:rPr>
+          <w:rStyle w:val="VerbatimChar"/>
+        </w:rPr>
+        <w:t xml:space="preserve">1.0.0-dev-0.9.9 → 1.0.0-dev-1.0.0</w:t>
+      </w:r>
+      <w:r>
+        <w:t xml:space="preserve">;</w:t>
+      </w:r>
+      <w:r>
+        <w:t xml:space="preserve"> </w:t>
+      </w:r>
+      <w:r>
+        <w:rPr>
+          <w:rStyle w:val="VerbatimChar"/>
+        </w:rPr>
+        <w:t xml:space="preserve">0.9.9 → 1.0.0</w:t>
+      </w:r>
+      <w:r>
+        <w:t xml:space="preserve">;</w:t>
+      </w:r>
+      <w:r>
+        <w:t xml:space="preserve"> </w:t>
+      </w:r>
+      <w:r>
+        <w:rPr>
+          <w:rStyle w:val="VerbatimChar"/>
+        </w:rPr>
+        <w:t xml:space="preserve">9.9.9 → 10.0.0</w:t>
+      </w:r>
+      <w:r>
+        <w:t xml:space="preserve">. A non-leftmost position above 9 (e.g.</w:t>
+      </w:r>
+      <w:r>
+        <w:t xml:space="preserve"> </w:t>
+      </w:r>
+      <w:r>
+        <w:rPr>
+          <w:rStyle w:val="VerbatimChar"/>
+        </w:rPr>
+        <w:t xml:space="preserve">0.0.10</w:t>
+      </w:r>
+      <w:r>
+        <w:t xml:space="preserve">) is the no-carry form and a violation. A rollover is a CARRY, not a reset and not a skip:</w:t>
+      </w:r>
+      <w:r>
+        <w:t xml:space="preserve"> </w:t>
+      </w:r>
+      <w:r>
+        <w:rPr>
+          <w:rStyle w:val="VerbatimChar"/>
+        </w:rPr>
+        <w:t xml:space="preserve">0.0.9 → 0.1.0</w:t>
+      </w:r>
+      <w:r>
+        <w:t xml:space="preserve"> </w:t>
+      </w:r>
+      <w:r>
+        <w:t xml:space="preserve">is the immediate successor, so the §11.4.151 "never reset, never skipped" discipline holds — no id is reused and none is jumped; where a consumer also derives an integer version CODE from the id, its encoding MUST be strictly monotone over carried ids (a positional-weight code is), and an encoder whose domain cannot represent the next carried id MUST refuse loudly rather than wrap or collide (§11.4.6) — widening that domain is tracked work, never a silent truncation. The consumer's ONE version tool (DATA per §11.4.35) is the single implementation (§11.4.28 / §11.4.251); a hand-rolled or hand-edited increment is a violation.</w:t>
+      </w:r>
+    </w:p>
+    <w:p>
+      <w:pPr>
+        <w:pStyle w:val="BodyText"/>
+      </w:pPr>
+      <w:r>
+        <w:rPr>
+          <w:b/>
+          <w:bCs/>
+        </w:rPr>
+        <w:t xml:space="preserve">(E.6) HONEST BOUNDARY (§11.4.6).</w:t>
+      </w:r>
+      <w:r>
+        <w:t xml:space="preserve"> </w:t>
+      </w:r>
+      <w:r>
+        <w:t xml:space="preserve">Clause (E) makes deploying and live-verifying every completed group mandatory and mechanical. It does NOT replace §11.4.185 manual QA, the §11.4.40 tag preconditions, or the §11.4.236 readiness verdict for a QA hand-off; it never flashes a build lacking its review GO (clause (A)); it never authorises bypassing the consumer's official flash tooling or power-cycling hardware outside its authorised recovery path (§11.4.133 / §11.4.144); and a live PASS on the available devices proves those devices only — hardware variants not attached are an enumerated gap (§11.4.118), never an implied PASS.</w:t>
+      </w:r>
+    </w:p>
+    <w:p>
+      <w:pPr>
+        <w:pStyle w:val="BodyText"/>
+      </w:pPr>
+      <w:r>
+        <w:rPr>
+          <w:b/>
+          <w:bCs/>
+        </w:rPr>
+        <w:t xml:space="preserve">Honest boundary for clauses (A)–(E) (§11.4.6):</w:t>
+      </w:r>
+      <w:r>
+        <w:t xml:space="preserve"> </w:t>
+      </w:r>
+      <w:r>
+        <w:t xml:space="preserve">this anchor relocates the TEST-INSTRUMENTATION re-review + gate/check hardening OFF the build critical path; does NOT weaken any substantive gate. The SOURCE-correctness review (§11.4.125/§11.4.142/§11.4.194 Opus-</w:t>
       </w:r>
       <w:r>
         <w:rPr>
@@ -32246,7 +32940,7 @@
         <w:t xml:space="preserve"> </w:t>
       </w:r>
       <w:r>
-        <w:t xml:space="preserve">§11.4.209 → GO §11.4.134) STILL PRECEDES + gates the build (it IS "source proven-correct"); pre/post-build tests (§11.4.108 L1-2) run at their seams; §11.4.185 manual-QA-final un-weakened; §11.4.129/§11.4.40 un-weakened. "Test-side work is parallel, never a build gate" is bounded to future-regression instrumentation — a check that proves the SHIPPED artifact wrong is a source/artifact-correctness gate (§11.4.108 L1-2), stays on the critical path. Clause (D) supplies the mandatory classification mechanism this boundary's own test presupposes — a review that never classifies its findings has not actually applied this honest boundary, it has merely stated it.</w:t>
+        <w:t xml:space="preserve">§11.4.209 → GO §11.4.134) STILL PRECEDES + gates the build (it IS "source proven-correct"); pre/post-build tests (§11.4.108 L1-2) run at their seams; §11.4.185 manual-QA-final un-weakened; §11.4.129/§11.4.40 un-weakened. "Test-side work is parallel, never a build gate" is bounded to future-regression instrumentation — a check that proves the SHIPPED artifact wrong is a source/artifact-correctness gate (§11.4.108 L1-2), stays on the critical path. Clause (D) supplies the mandatory classification mechanism this boundary's own test presupposes — a review that never classifies its findings has not actually applied this honest boundary, it has merely stated it. Clause (E) adds deployment and live-verification obligations on top of (A)–(D) and weakens none of them: its own boundary (E.6) applies in full — no manual-QA, tag, or readiness gate is replaced, no un-GO'd build is flashed, no device is flashed outside its eligibility or lease, and a live PASS proves only the devices it ran on.</w:t>
       </w:r>
     </w:p>
     <w:p>
@@ -32254,6 +32948,18 @@
         <w:pStyle w:val="BodyText"/>
       </w:pPr>
       <w:r>
+        <w:rPr>
+          <w:i/>
+          <w:iCs/>
+        </w:rPr>
+        <w:t xml:space="preserve">(Process note for future extenders: §11.4.235's next free clause letter is (F); never reuse (A)–(E).)</w:t>
+      </w:r>
+    </w:p>
+    <w:p>
+      <w:pPr>
+        <w:pStyle w:val="BodyText"/>
+      </w:pPr>
+      <w:r>
         <w:t xml:space="preserve">Classification: universal (§11.4.17). Propagation gate</w:t>
       </w:r>
       <w:r>
@@ -32476,7 +33182,199 @@
         <w:t xml:space="preserve">cm_build_on_source_proven_not_test_side.sh</w:t>
       </w:r>
       <w:r>
-        <w:t xml:space="preserve">'s own tested logic.</w:t>
+        <w:t xml:space="preserve">'s own tested logic. Clause (E) adds two recommended gates.</w:t>
+      </w:r>
+      <w:r>
+        <w:t xml:space="preserve"> </w:t>
+      </w:r>
+      <w:r>
+        <w:rPr>
+          <w:rStyle w:val="VerbatimChar"/>
+        </w:rPr>
+        <w:t xml:space="preserve">CM-GROUP-DEPLOY-FLASH-ALL-AND-LIVE-VERIFIED</w:t>
+      </w:r>
+      <w:r>
+        <w:t xml:space="preserve"> </w:t>
+      </w:r>
+      <w:r>
+        <w:t xml:space="preserve">(binds per (E.4) — every consumer with an official flash/deploy entry point, or a bound deploy ledger, for a device-targeted artifact; FAIL: such a consumer with no declared device-listing command (config error); a per-device SKIP code outside the consumer's §11.4.69 closed set; a lease-held device recorded as a §11.4.69 SKIP instead of DEFERRED; a device DEFERRED for more than its declared N consecutive builds with no escalation item; a group holding its GO that no completed covered image was ever flashed for; an enumerated device absent from the deploy record with no per-device FAIL or SKIP reason; a device flashed while ineligible for the image or without its lease; a flashed device with no §11.4.200 read-back; a contained item with no per-device live verdict or per-item SKIP-with-reason; a zero-device run recorded as PASS; golden-FALSE per §11.4.201(1): every available device flashed and read-back-verified with sanity and per-item verdicts present, every ineligible device recorded as a reasoned closed-set SKIP and every leased device as DEFERRED with its holder, and a consumer with no device-targeted flash/deploy entry point and no such bound ledger recorded N/A, does not fire) + paired §1.1 mutation (drop one enumerated serial from the deploy record, strip one item's live verdict, or record a zero-device run as PASS → the gate MUST FAIL) — gate-code NOT claimed shipped (§11.4.6 / §11.4.227), registered as tracked deferral OWED-GATE-114 in</w:t>
+      </w:r>
+      <w:r>
+        <w:t xml:space="preserve"> </w:t>
+      </w:r>
+      <w:r>
+        <w:rPr>
+          <w:rStyle w:val="VerbatimChar"/>
+        </w:rPr>
+        <w:t xml:space="preserve">constitution/scripts/gates/gate_ledger_deferrals.tsv</w:t>
+      </w:r>
+      <w:r>
+        <w:t xml:space="preserve">.</w:t>
+      </w:r>
+      <w:r>
+        <w:t xml:space="preserve"> </w:t>
+      </w:r>
+      <w:r>
+        <w:rPr>
+          <w:rStyle w:val="VerbatimChar"/>
+        </w:rPr>
+        <w:t xml:space="preserve">CM-VERSION-DECIMAL-CARRY</w:t>
+      </w:r>
+      <w:r>
+        <w:t xml:space="preserve"> </w:t>
+      </w:r>
+      <w:r>
+        <w:t xml:space="preserve">(the carry check is armed only for a gate config declaring a positional-digit</w:t>
+      </w:r>
+      <w:r>
+        <w:t xml:space="preserve"> </w:t>
+      </w:r>
+      <w:r>
+        <w:rPr>
+          <w:rStyle w:val="VerbatimChar"/>
+        </w:rPr>
+        <w:t xml:space="preserve">version_scheme</w:t>
+      </w:r>
+      <w:r>
+        <w:t xml:space="preserve">, and binds only ledger rows after its declared</w:t>
+      </w:r>
+      <w:r>
+        <w:t xml:space="preserve"> </w:t>
+      </w:r>
+      <w:r>
+        <w:rPr>
+          <w:rStyle w:val="VerbatimChar"/>
+        </w:rPr>
+        <w:t xml:space="preserve">carry_adoption_marker</w:t>
+      </w:r>
+      <w:r>
+        <w:t xml:space="preserve"> </w:t>
+      </w:r>
+      <w:r>
+        <w:t xml:space="preserve">when one is set; FAIL: such a row that breaks the (E.5) positional-digit id grammar — ANY dotted numeric group with a non-leftmost position that is not a single digit 0..9 or a leftmost leading zero (a suffix or build-metadata group included), two numeric runs joined by a single dash, or an owned group with a leading zero; UNDECLARED (distinct; a consuming release seam MUST treat it as blocking per §11.4.135 — no seam consumes the gate yet, an obligation each consuming project tracks per §11.4.197): a bound deploy ledger with no declared</w:t>
+      </w:r>
+      <w:r>
+        <w:t xml:space="preserve"> </w:t>
+      </w:r>
+      <w:r>
+        <w:rPr>
+          <w:rStyle w:val="VerbatimChar"/>
+        </w:rPr>
+        <w:t xml:space="preserve">version_scheme</w:t>
+      </w:r>
+      <w:r>
+        <w:t xml:space="preserve">, or a non-positional scheme with no</w:t>
+      </w:r>
+      <w:r>
+        <w:t xml:space="preserve"> </w:t>
+      </w:r>
+      <w:r>
+        <w:rPr>
+          <w:rStyle w:val="VerbatimChar"/>
+        </w:rPr>
+        <w:t xml:space="preserve">scheme_decision_ref</w:t>
+      </w:r>
+      <w:r>
+        <w:t xml:space="preserve">; golden-FALSE:</w:t>
+      </w:r>
+      <w:r>
+        <w:t xml:space="preserve"> </w:t>
+      </w:r>
+      <w:r>
+        <w:rPr>
+          <w:rStyle w:val="VerbatimChar"/>
+        </w:rPr>
+        <w:t xml:space="preserve">9.9.9 → 10.0.0</w:t>
+      </w:r>
+      <w:r>
+        <w:t xml:space="preserve">, opaque non-dotted ids, an EXPLICITLY declared non-positional scheme, and pre-marker rows do not fire; a declared marker absent from the ledger, a named config that is missing or unreadable, an unknown, duplicated or empty config key, or a ledger row that is not exactly two non-empty TAB-separated fields is a config error, never a silent pass or a SKIP) is IMPLEMENTED as an added check inside</w:t>
+      </w:r>
+      <w:r>
+        <w:t xml:space="preserve"> </w:t>
+      </w:r>
+      <w:r>
+        <w:rPr>
+          <w:rStyle w:val="VerbatimChar"/>
+        </w:rPr>
+        <w:t xml:space="preserve">constitution/scripts/gates/cm_version_increment_on_deploy.sh</w:t>
+      </w:r>
+      <w:r>
+        <w:t xml:space="preserve">, with its discriminators in the paired</w:t>
+      </w:r>
+      <w:r>
+        <w:t xml:space="preserve"> </w:t>
+      </w:r>
+      <w:r>
+        <w:rPr>
+          <w:rStyle w:val="VerbatimChar"/>
+        </w:rPr>
+        <w:t xml:space="preserve">cm_version_increment_on_deploy_mutation_test.sh</w:t>
+      </w:r>
+      <w:r>
+        <w:t xml:space="preserve"> </w:t>
+      </w:r>
+      <w:r>
+        <w:t xml:space="preserve">(RED observed before the check existed); every gate run prints machine-readable</w:t>
+      </w:r>
+      <w:r>
+        <w:t xml:space="preserve"> </w:t>
+      </w:r>
+      <w:r>
+        <w:rPr>
+          <w:rStyle w:val="VerbatimChar"/>
+        </w:rPr>
+        <w:t xml:space="preserve">VERDICT:</w:t>
+      </w:r>
+      <w:r>
+        <w:t xml:space="preserve"> </w:t>
+      </w:r>
+      <w:r>
+        <w:t xml:space="preserve">and</w:t>
+      </w:r>
+      <w:r>
+        <w:t xml:space="preserve"> </w:t>
+      </w:r>
+      <w:r>
+        <w:rPr>
+          <w:rStyle w:val="VerbatimChar"/>
+        </w:rPr>
+        <w:t xml:space="preserve">CARRY:</w:t>
+      </w:r>
+      <w:r>
+        <w:t xml:space="preserve"> </w:t>
+      </w:r>
+      <w:r>
+        <w:t xml:space="preserve">lines that callers MUST parse, and every VERDICT has its own exit code (0 PASS, 1 FAIL, 2 config error, 3 UNDECLARED, 4 SKIP) so a SKIP can never be read as a PASS — the exit code alone is ambiguous by design (0 covers CARRY PASS and CARRY SKIP; 1 covers a version-id collision and a carry failure), and the informational modes</w:t>
+      </w:r>
+      <w:r>
+        <w:t xml:space="preserve"> </w:t>
+      </w:r>
+      <w:r>
+        <w:rPr>
+          <w:rStyle w:val="VerbatimChar"/>
+        </w:rPr>
+        <w:t xml:space="preserve">--help</w:t>
+      </w:r>
+      <w:r>
+        <w:t xml:space="preserve"> </w:t>
+      </w:r>
+      <w:r>
+        <w:t xml:space="preserve">/</w:t>
+      </w:r>
+      <w:r>
+        <w:t xml:space="preserve"> </w:t>
+      </w:r>
+      <w:r>
+        <w:rPr>
+          <w:rStyle w:val="VerbatimChar"/>
+        </w:rPr>
+        <w:t xml:space="preserve">--print-example-config</w:t>
+      </w:r>
+      <w:r>
+        <w:t xml:space="preserve"> </w:t>
+      </w:r>
+      <w:r>
+        <w:t xml:space="preserve">exit 0 with NO verdict line and are refused unless used alone; honest scope: it proves no in-scope deployed id is in the no-carry form, not that each deploy used the immediate successor, and it SKIPs (exit 4, never the PASS code) only for a consumer that has bound no deploy ledger — which for a consumer bound by (E.4) is a config error at the release seam, per (E.5) — or whose bound ledger has no recorded deploys yet.</w:t>
       </w:r>
     </w:p>
     <w:p>
@@ -32554,6 +33452,66 @@
           <w:rStyle w:val="VerbatimChar"/>
         </w:rPr>
         <w:t xml:space="preserve">--serialise-build-and-validate</w:t>
+      </w:r>
+      <w:r>
+        <w:t xml:space="preserve">,</w:t>
+      </w:r>
+      <w:r>
+        <w:t xml:space="preserve"> </w:t>
+      </w:r>
+      <w:r>
+        <w:rPr>
+          <w:rStyle w:val="VerbatimChar"/>
+        </w:rPr>
+        <w:t xml:space="preserve">--flash-one-device-only</w:t>
+      </w:r>
+      <w:r>
+        <w:t xml:space="preserve">,</w:t>
+      </w:r>
+      <w:r>
+        <w:t xml:space="preserve"> </w:t>
+      </w:r>
+      <w:r>
+        <w:rPr>
+          <w:rStyle w:val="VerbatimChar"/>
+        </w:rPr>
+        <w:t xml:space="preserve">--skip-live-item-verification</w:t>
+      </w:r>
+      <w:r>
+        <w:t xml:space="preserve">,</w:t>
+      </w:r>
+      <w:r>
+        <w:t xml:space="preserve"> </w:t>
+      </w:r>
+      <w:r>
+        <w:rPr>
+          <w:rStyle w:val="VerbatimChar"/>
+        </w:rPr>
+        <w:t xml:space="preserve">--zero-devices-is-pass</w:t>
+      </w:r>
+      <w:r>
+        <w:t xml:space="preserve">,</w:t>
+      </w:r>
+      <w:r>
+        <w:t xml:space="preserve"> </w:t>
+      </w:r>
+      <w:r>
+        <w:rPr>
+          <w:rStyle w:val="VerbatimChar"/>
+        </w:rPr>
+        <w:t xml:space="preserve">--hand-rolled-version-bump</w:t>
+      </w:r>
+      <w:r>
+        <w:t xml:space="preserve">,</w:t>
+      </w:r>
+      <w:r>
+        <w:t xml:space="preserve"> </w:t>
+      </w:r>
+      <w:r>
+        <w:rPr>
+          <w:rStyle w:val="VerbatimChar"/>
+        </w:rPr>
+        <w:t xml:space="preserve">--no-carry-version</w:t>
       </w:r>
       <w:r>
         <w:t xml:space="preserve">.</w:t>
@@ -46791,8 +47749,8 @@
     </w:pPr>
     <w:rPr>
       <w:rFonts w:asciiTheme="majorHAnsi" w:cstheme="majorBidi" w:eastAsiaTheme="majorEastAsia" w:hAnsiTheme="majorHAnsi"/>
-      <w:sz w:val="56"/>
-      <w:szCs w:val="56"/>
+      <w:sz w:val="40"/>
+      <w:szCs w:val="40"/>
     </w:rPr>
   </w:style>
   <w:style w:customStyle="1" w:styleId="TitleChar" w:type="character">
@@ -46926,8 +47884,8 @@
     <w:rPr>
       <w:rFonts w:asciiTheme="majorHAnsi" w:cstheme="majorBidi" w:eastAsiaTheme="majorEastAsia" w:hAnsiTheme="majorHAnsi"/>
       <w:color w:themeColor="accent1" w:themeShade="BF" w:val="0F4761"/>
-      <w:sz w:val="40"/>
-      <w:szCs w:val="40"/>
+      <w:sz w:val="32"/>
+      <w:szCs w:val="32"/>
     </w:rPr>
   </w:style>
   <w:style w:styleId="Heading2" w:type="paragraph">
@@ -46949,8 +47907,8 @@
     <w:rPr>
       <w:rFonts w:asciiTheme="majorHAnsi" w:cstheme="majorBidi" w:eastAsiaTheme="majorEastAsia" w:hAnsiTheme="majorHAnsi"/>
       <w:color w:themeColor="accent1" w:themeShade="BF" w:val="0F4761"/>
-      <w:sz w:val="32"/>
-      <w:szCs w:val="32"/>
+      <w:sz w:val="26"/>
+      <w:szCs w:val="26"/>
     </w:rPr>
   </w:style>
   <w:style w:styleId="Heading3" w:type="paragraph">
@@ -46972,8 +47930,8 @@
     <w:rPr>
       <w:rFonts w:cstheme="majorBidi" w:eastAsiaTheme="majorEastAsia"/>
       <w:color w:themeColor="accent1" w:themeShade="BF" w:val="0F4761"/>
-      <w:sz w:val="28"/>
-      <w:szCs w:val="28"/>
+      <w:sz w:val="24"/>
+      <w:szCs w:val="24"/>
     </w:rPr>
   </w:style>
   <w:style w:styleId="Heading4" w:type="paragraph">
@@ -46993,6 +47951,8 @@
       <w:outlineLvl w:val="3"/>
     </w:pPr>
     <w:rPr>
+      <w:sz w:val="22"/>
+      <w:szCs w:val="22"/>
       <w:rFonts w:cstheme="majorBidi" w:eastAsiaTheme="majorEastAsia"/>
       <w:i/>
       <w:iCs/>

</xml_diff>